<commit_message>
DA21 GO SIYAHA: plan d'investissement Word aligne sur Excel (forage en amenagement, construction 10,1%) + cahier des travaux pour entreprise construction/amenagement
</commit_message>
<xml_diff>
--- a/DA21_Plan_Investissement_Analyse.docx
+++ b/DA21_Plan_Investissement_Analyse.docx
@@ -23,9 +23,9 @@
         <w:rPr>
           <w:b/>
           <w:color w:val="C8A440"/>
-          <w:sz w:val="32"/>
+          <w:sz w:val="30"/>
         </w:rPr>
-        <w:t>PLAN D'INVESTISSEMENT DÉTAILLÉ</w:t>
+        <w:t>PLAN D'INVESTISSEMENT DÉTAILLÉ &amp; CAHIER DES TRAVAUX</w:t>
       </w:r>
     </w:p>
     <w:p>
@@ -35,28 +35,15 @@
       <w:r>
         <w:rPr>
           <w:color w:val="555555"/>
-          <w:sz w:val="22"/>
+          <w:sz w:val="21"/>
         </w:rPr>
-        <w:t>Programme GO SIYAHA – Volet soutien à l'investissement (Istitmar) — Édition 2026</w:t>
-      </w:r>
-    </w:p>
-    <w:p>
-      <w:pPr>
-        <w:jc w:val="center"/>
-      </w:pPr>
-      <w:r>
-        <w:rPr>
-          <w:i/>
-          <w:color w:val="555555"/>
-          <w:sz w:val="20"/>
-        </w:rPr>
-        <w:t>Document d'analyse — ICE 003934997000054</w:t>
+        <w:t>Programme GO SIYAHA – Istitmar 2026  |  ICE 003934997000054</w:t>
       </w:r>
     </w:p>
     <w:p/>
     <w:p>
       <w:pPr>
-        <w:spacing w:after="120" w:before="200"/>
+        <w:spacing w:before="240" w:after="120"/>
       </w:pPr>
       <w:r>
         <w:rPr>
@@ -64,44 +51,7 @@
           <w:color w:val="1B3A28"/>
           <w:sz w:val="30"/>
         </w:rPr>
-        <w:t>1. Présentation synthétique du projet</w:t>
-      </w:r>
-    </w:p>
-    <w:p>
-      <w:pPr>
-        <w:spacing w:after="80"/>
-      </w:pPr>
-      <w:r>
-        <w:rPr>
-          <w:b w:val="0"/>
-          <w:sz w:val="21"/>
-        </w:rPr>
-        <w:t>Complexe d'animation touristique intégré sur 1 hectare, implanté dans une oliveraie adulte à 25 minutes de Marrakech, combinant trois offres d'animation : balades e-bike / Fatbike, paintball (jour et nocturne UV) et ateliers de cuisine marocaine. Une tente caïdale climatisée sert d'espace de restauration des ateliers ; une piscine constitue une prestation complémentaire de détente (financée hors programme primé).</w:t>
-      </w:r>
-    </w:p>
-    <w:p>
-      <w:pPr>
-        <w:spacing w:after="80"/>
-      </w:pPr>
-      <w:r>
-        <w:rPr>
-          <w:b w:val="0"/>
-          <w:sz w:val="21"/>
-        </w:rPr>
-        <w:t>Démarrage de l'exploitation prévu en juin 2027 : l'année 2026 et le premier semestre 2027 sont consacrés à la construction et à l'équipement. Chiffre d'affaires inscrit intégralement en « Animation ».</w:t>
-      </w:r>
-    </w:p>
-    <w:p>
-      <w:pPr>
-        <w:spacing w:after="120" w:before="200"/>
-      </w:pPr>
-      <w:r>
-        <w:rPr>
-          <w:b/>
-          <w:color w:val="1B3A28"/>
-          <w:sz w:val="30"/>
-        </w:rPr>
-        <w:t>2. Programme d'investissement primable (assiette de la prime)</w:t>
+        <w:t>1. Programme d'investissement primable (assiette de la prime)</w:t>
       </w:r>
     </w:p>
     <w:tbl>
@@ -120,7 +70,7 @@
       <w:tr>
         <w:tc>
           <w:tcPr>
-            <w:tcW w:type="dxa" w:w="5386"/>
+            <w:tcW w:type="dxa" w:w="5443"/>
             <w:shd w:fill="1B3A28"/>
           </w:tcPr>
           <w:p>
@@ -137,7 +87,7 @@
         </w:tc>
         <w:tc>
           <w:tcPr>
-            <w:tcW w:type="dxa" w:w="1474"/>
+            <w:tcW w:type="dxa" w:w="1361"/>
             <w:shd w:fill="1B3A28"/>
           </w:tcPr>
           <w:p>
@@ -154,24 +104,7 @@
         </w:tc>
         <w:tc>
           <w:tcPr>
-            <w:tcW w:type="dxa" w:w="1247"/>
-            <w:shd w:fill="1B3A28"/>
-          </w:tcPr>
-          <w:p>
-            <w:r/>
-            <w:r>
-              <w:rPr>
-                <w:b/>
-                <w:color w:val="FFFFFF"/>
-                <w:sz w:val="19"/>
-              </w:rPr>
-              <w:t>TVA 20%</w:t>
-            </w:r>
-          </w:p>
-        </w:tc>
-        <w:tc>
-          <w:tcPr>
-            <w:tcW w:type="dxa" w:w="1474"/>
+            <w:tcW w:type="dxa" w:w="1361"/>
             <w:shd w:fill="1B3A28"/>
           </w:tcPr>
           <w:p>
@@ -186,11 +119,28 @@
             </w:r>
           </w:p>
         </w:tc>
+        <w:tc>
+          <w:tcPr>
+            <w:tcW w:type="dxa" w:w="1020"/>
+            <w:shd w:fill="1B3A28"/>
+          </w:tcPr>
+          <w:p>
+            <w:r/>
+            <w:r>
+              <w:rPr>
+                <w:b/>
+                <w:color w:val="FFFFFF"/>
+                <w:sz w:val="19"/>
+              </w:rPr>
+              <w:t>% projet</w:t>
+            </w:r>
+          </w:p>
+        </w:tc>
       </w:tr>
       <w:tr>
         <w:tc>
           <w:tcPr>
-            <w:tcW w:type="dxa" w:w="5386"/>
+            <w:tcW w:type="dxa" w:w="5443"/>
           </w:tcPr>
           <w:p>
             <w:r/>
@@ -205,7 +155,7 @@
         </w:tc>
         <w:tc>
           <w:tcPr>
-            <w:tcW w:type="dxa" w:w="1474"/>
+            <w:tcW w:type="dxa" w:w="1361"/>
           </w:tcPr>
           <w:p>
             <w:pPr>
@@ -217,13 +167,13 @@
                 <w:b/>
                 <w:sz w:val="19"/>
               </w:rPr>
-              <w:t>145 833</w:t>
+              <w:t>91 667</w:t>
             </w:r>
           </w:p>
         </w:tc>
         <w:tc>
           <w:tcPr>
-            <w:tcW w:type="dxa" w:w="1247"/>
+            <w:tcW w:type="dxa" w:w="1361"/>
           </w:tcPr>
           <w:p>
             <w:pPr>
@@ -235,13 +185,13 @@
                 <w:b/>
                 <w:sz w:val="19"/>
               </w:rPr>
-              <w:t>29 167</w:t>
+              <w:t>110 000</w:t>
             </w:r>
           </w:p>
         </w:tc>
         <w:tc>
           <w:tcPr>
-            <w:tcW w:type="dxa" w:w="1474"/>
+            <w:tcW w:type="dxa" w:w="1020"/>
           </w:tcPr>
           <w:p>
             <w:pPr>
@@ -253,7 +203,7 @@
                 <w:b/>
                 <w:sz w:val="19"/>
               </w:rPr>
-              <w:t>175 000</w:t>
+              <w:t>10,1 %</w:t>
             </w:r>
           </w:p>
         </w:tc>
@@ -261,7 +211,7 @@
       <w:tr>
         <w:tc>
           <w:tcPr>
-            <w:tcW w:type="dxa" w:w="5386"/>
+            <w:tcW w:type="dxa" w:w="5443"/>
           </w:tcPr>
           <w:p>
             <w:r/>
@@ -275,7 +225,7 @@
         </w:tc>
         <w:tc>
           <w:tcPr>
-            <w:tcW w:type="dxa" w:w="1474"/>
+            <w:tcW w:type="dxa" w:w="1361"/>
           </w:tcPr>
           <w:p>
             <w:pPr>
@@ -292,24 +242,7 @@
         </w:tc>
         <w:tc>
           <w:tcPr>
-            <w:tcW w:type="dxa" w:w="1247"/>
-          </w:tcPr>
-          <w:p>
-            <w:pPr>
-              <w:jc w:val="right"/>
-            </w:pPr>
-            <w:r/>
-            <w:r>
-              <w:rPr>
-                <w:sz w:val="19"/>
-              </w:rPr>
-              <w:t>18 333</w:t>
-            </w:r>
-          </w:p>
-        </w:tc>
-        <w:tc>
-          <w:tcPr>
-            <w:tcW w:type="dxa" w:w="1474"/>
+            <w:tcW w:type="dxa" w:w="1361"/>
           </w:tcPr>
           <w:p>
             <w:pPr>
@@ -324,25 +257,9 @@
             </w:r>
           </w:p>
         </w:tc>
-      </w:tr>
-      <w:tr>
         <w:tc>
           <w:tcPr>
-            <w:tcW w:type="dxa" w:w="5386"/>
-          </w:tcPr>
-          <w:p>
-            <w:r/>
-            <w:r>
-              <w:rPr>
-                <w:sz w:val="19"/>
-              </w:rPr>
-              <w:t xml:space="preserve">  · Puits — forage + génie civil (hors pompe)</w:t>
-            </w:r>
-          </w:p>
-        </w:tc>
-        <w:tc>
-          <w:tcPr>
-            <w:tcW w:type="dxa" w:w="1474"/>
+            <w:tcW w:type="dxa" w:w="1020"/>
           </w:tcPr>
           <w:p>
             <w:pPr>
@@ -353,41 +270,6 @@
               <w:rPr>
                 <w:sz w:val="19"/>
               </w:rPr>
-              <w:t>54 167</w:t>
-            </w:r>
-          </w:p>
-        </w:tc>
-        <w:tc>
-          <w:tcPr>
-            <w:tcW w:type="dxa" w:w="1247"/>
-          </w:tcPr>
-          <w:p>
-            <w:pPr>
-              <w:jc w:val="right"/>
-            </w:pPr>
-            <w:r/>
-            <w:r>
-              <w:rPr>
-                <w:sz w:val="19"/>
-              </w:rPr>
-              <w:t>10 833</w:t>
-            </w:r>
-          </w:p>
-        </w:tc>
-        <w:tc>
-          <w:tcPr>
-            <w:tcW w:type="dxa" w:w="1474"/>
-          </w:tcPr>
-          <w:p>
-            <w:pPr>
-              <w:jc w:val="right"/>
-            </w:pPr>
-            <w:r/>
-            <w:r>
-              <w:rPr>
-                <w:sz w:val="19"/>
-              </w:rPr>
-              <w:t>65 000</w:t>
             </w:r>
           </w:p>
         </w:tc>
@@ -395,7 +277,7 @@
       <w:tr>
         <w:tc>
           <w:tcPr>
-            <w:tcW w:type="dxa" w:w="5386"/>
+            <w:tcW w:type="dxa" w:w="5443"/>
           </w:tcPr>
           <w:p>
             <w:r/>
@@ -404,13 +286,13 @@
                 <w:b/>
                 <w:sz w:val="19"/>
               </w:rPr>
-              <w:t>AMÉNAGEMENT &amp; AGENCEMENT</w:t>
+              <w:t>AMÉNAGEMENT &amp; AGENCEMENT (y compris infrastructure)</w:t>
             </w:r>
           </w:p>
         </w:tc>
         <w:tc>
           <w:tcPr>
-            <w:tcW w:type="dxa" w:w="1474"/>
+            <w:tcW w:type="dxa" w:w="1361"/>
           </w:tcPr>
           <w:p>
             <w:pPr>
@@ -422,13 +304,13 @@
                 <w:b/>
                 <w:sz w:val="19"/>
               </w:rPr>
-              <w:t>258 333</w:t>
+              <w:t>341 667</w:t>
             </w:r>
           </w:p>
         </w:tc>
         <w:tc>
           <w:tcPr>
-            <w:tcW w:type="dxa" w:w="1247"/>
+            <w:tcW w:type="dxa" w:w="1361"/>
           </w:tcPr>
           <w:p>
             <w:pPr>
@@ -440,13 +322,13 @@
                 <w:b/>
                 <w:sz w:val="19"/>
               </w:rPr>
-              <w:t>51 667</w:t>
+              <w:t>410 000</w:t>
             </w:r>
           </w:p>
         </w:tc>
         <w:tc>
           <w:tcPr>
-            <w:tcW w:type="dxa" w:w="1474"/>
+            <w:tcW w:type="dxa" w:w="1020"/>
           </w:tcPr>
           <w:p>
             <w:pPr>
@@ -458,7 +340,7 @@
                 <w:b/>
                 <w:sz w:val="19"/>
               </w:rPr>
-              <w:t>310 000</w:t>
+              <w:t>37,6 %</w:t>
             </w:r>
           </w:p>
         </w:tc>
@@ -466,7 +348,7 @@
       <w:tr>
         <w:tc>
           <w:tcPr>
-            <w:tcW w:type="dxa" w:w="5386"/>
+            <w:tcW w:type="dxa" w:w="5443"/>
           </w:tcPr>
           <w:p>
             <w:r/>
@@ -474,13 +356,79 @@
               <w:rPr>
                 <w:sz w:val="19"/>
               </w:rPr>
-              <w:t xml:space="preserve">  · Tentes caïdales + climatisation + mobilier + sonorisation DJ</w:t>
+              <w:t xml:space="preserve">  · Forage puits + infrastructure hydraulique (clé en main)</w:t>
             </w:r>
           </w:p>
         </w:tc>
         <w:tc>
           <w:tcPr>
-            <w:tcW w:type="dxa" w:w="1474"/>
+            <w:tcW w:type="dxa" w:w="1361"/>
+          </w:tcPr>
+          <w:p>
+            <w:pPr>
+              <w:jc w:val="right"/>
+            </w:pPr>
+            <w:r/>
+            <w:r>
+              <w:rPr>
+                <w:sz w:val="19"/>
+              </w:rPr>
+              <w:t>83 333</w:t>
+            </w:r>
+          </w:p>
+        </w:tc>
+        <w:tc>
+          <w:tcPr>
+            <w:tcW w:type="dxa" w:w="1361"/>
+          </w:tcPr>
+          <w:p>
+            <w:pPr>
+              <w:jc w:val="right"/>
+            </w:pPr>
+            <w:r/>
+            <w:r>
+              <w:rPr>
+                <w:sz w:val="19"/>
+              </w:rPr>
+              <w:t>100 000</w:t>
+            </w:r>
+          </w:p>
+        </w:tc>
+        <w:tc>
+          <w:tcPr>
+            <w:tcW w:type="dxa" w:w="1020"/>
+          </w:tcPr>
+          <w:p>
+            <w:pPr>
+              <w:jc w:val="right"/>
+            </w:pPr>
+            <w:r/>
+            <w:r>
+              <w:rPr>
+                <w:sz w:val="19"/>
+              </w:rPr>
+            </w:r>
+          </w:p>
+        </w:tc>
+      </w:tr>
+      <w:tr>
+        <w:tc>
+          <w:tcPr>
+            <w:tcW w:type="dxa" w:w="5443"/>
+          </w:tcPr>
+          <w:p>
+            <w:r/>
+            <w:r>
+              <w:rPr>
+                <w:sz w:val="19"/>
+              </w:rPr>
+              <w:t xml:space="preserve">  · Tente caïdale + climatisation + mobilier + sonorisation DJ</w:t>
+            </w:r>
+          </w:p>
+        </w:tc>
+        <w:tc>
+          <w:tcPr>
+            <w:tcW w:type="dxa" w:w="1361"/>
           </w:tcPr>
           <w:p>
             <w:pPr>
@@ -497,24 +445,7 @@
         </w:tc>
         <w:tc>
           <w:tcPr>
-            <w:tcW w:type="dxa" w:w="1247"/>
-          </w:tcPr>
-          <w:p>
-            <w:pPr>
-              <w:jc w:val="right"/>
-            </w:pPr>
-            <w:r/>
-            <w:r>
-              <w:rPr>
-                <w:sz w:val="19"/>
-              </w:rPr>
-              <w:t>28 333</w:t>
-            </w:r>
-          </w:p>
-        </w:tc>
-        <w:tc>
-          <w:tcPr>
-            <w:tcW w:type="dxa" w:w="1474"/>
+            <w:tcW w:type="dxa" w:w="1361"/>
           </w:tcPr>
           <w:p>
             <w:pPr>
@@ -529,11 +460,27 @@
             </w:r>
           </w:p>
         </w:tc>
+        <w:tc>
+          <w:tcPr>
+            <w:tcW w:type="dxa" w:w="1020"/>
+          </w:tcPr>
+          <w:p>
+            <w:pPr>
+              <w:jc w:val="right"/>
+            </w:pPr>
+            <w:r/>
+            <w:r>
+              <w:rPr>
+                <w:sz w:val="19"/>
+              </w:rPr>
+            </w:r>
+          </w:p>
+        </w:tc>
       </w:tr>
       <w:tr>
         <w:tc>
           <w:tcPr>
-            <w:tcW w:type="dxa" w:w="5386"/>
+            <w:tcW w:type="dxa" w:w="5443"/>
           </w:tcPr>
           <w:p>
             <w:r/>
@@ -547,7 +494,7 @@
         </w:tc>
         <w:tc>
           <w:tcPr>
-            <w:tcW w:type="dxa" w:w="1474"/>
+            <w:tcW w:type="dxa" w:w="1361"/>
           </w:tcPr>
           <w:p>
             <w:pPr>
@@ -564,24 +511,7 @@
         </w:tc>
         <w:tc>
           <w:tcPr>
-            <w:tcW w:type="dxa" w:w="1247"/>
-          </w:tcPr>
-          <w:p>
-            <w:pPr>
-              <w:jc w:val="right"/>
-            </w:pPr>
-            <w:r/>
-            <w:r>
-              <w:rPr>
-                <w:sz w:val="19"/>
-              </w:rPr>
-              <w:t>5 000</w:t>
-            </w:r>
-          </w:p>
-        </w:tc>
-        <w:tc>
-          <w:tcPr>
-            <w:tcW w:type="dxa" w:w="1474"/>
+            <w:tcW w:type="dxa" w:w="1361"/>
           </w:tcPr>
           <w:p>
             <w:pPr>
@@ -596,11 +526,27 @@
             </w:r>
           </w:p>
         </w:tc>
+        <w:tc>
+          <w:tcPr>
+            <w:tcW w:type="dxa" w:w="1020"/>
+          </w:tcPr>
+          <w:p>
+            <w:pPr>
+              <w:jc w:val="right"/>
+            </w:pPr>
+            <w:r/>
+            <w:r>
+              <w:rPr>
+                <w:sz w:val="19"/>
+              </w:rPr>
+            </w:r>
+          </w:p>
+        </w:tc>
       </w:tr>
       <w:tr>
         <w:tc>
           <w:tcPr>
-            <w:tcW w:type="dxa" w:w="5386"/>
+            <w:tcW w:type="dxa" w:w="5443"/>
           </w:tcPr>
           <w:p>
             <w:r/>
@@ -614,7 +560,7 @@
         </w:tc>
         <w:tc>
           <w:tcPr>
-            <w:tcW w:type="dxa" w:w="1474"/>
+            <w:tcW w:type="dxa" w:w="1361"/>
           </w:tcPr>
           <w:p>
             <w:pPr>
@@ -631,24 +577,7 @@
         </w:tc>
         <w:tc>
           <w:tcPr>
-            <w:tcW w:type="dxa" w:w="1247"/>
-          </w:tcPr>
-          <w:p>
-            <w:pPr>
-              <w:jc w:val="right"/>
-            </w:pPr>
-            <w:r/>
-            <w:r>
-              <w:rPr>
-                <w:sz w:val="19"/>
-              </w:rPr>
-              <w:t>10 000</w:t>
-            </w:r>
-          </w:p>
-        </w:tc>
-        <w:tc>
-          <w:tcPr>
-            <w:tcW w:type="dxa" w:w="1474"/>
+            <w:tcW w:type="dxa" w:w="1361"/>
           </w:tcPr>
           <w:p>
             <w:pPr>
@@ -663,11 +592,27 @@
             </w:r>
           </w:p>
         </w:tc>
+        <w:tc>
+          <w:tcPr>
+            <w:tcW w:type="dxa" w:w="1020"/>
+          </w:tcPr>
+          <w:p>
+            <w:pPr>
+              <w:jc w:val="right"/>
+            </w:pPr>
+            <w:r/>
+            <w:r>
+              <w:rPr>
+                <w:sz w:val="19"/>
+              </w:rPr>
+            </w:r>
+          </w:p>
+        </w:tc>
       </w:tr>
       <w:tr>
         <w:tc>
           <w:tcPr>
-            <w:tcW w:type="dxa" w:w="5386"/>
+            <w:tcW w:type="dxa" w:w="5443"/>
           </w:tcPr>
           <w:p>
             <w:r/>
@@ -681,7 +626,7 @@
         </w:tc>
         <w:tc>
           <w:tcPr>
-            <w:tcW w:type="dxa" w:w="1474"/>
+            <w:tcW w:type="dxa" w:w="1361"/>
           </w:tcPr>
           <w:p>
             <w:pPr>
@@ -698,24 +643,7 @@
         </w:tc>
         <w:tc>
           <w:tcPr>
-            <w:tcW w:type="dxa" w:w="1247"/>
-          </w:tcPr>
-          <w:p>
-            <w:pPr>
-              <w:jc w:val="right"/>
-            </w:pPr>
-            <w:r/>
-            <w:r>
-              <w:rPr>
-                <w:sz w:val="19"/>
-              </w:rPr>
-              <w:t>8 333</w:t>
-            </w:r>
-          </w:p>
-        </w:tc>
-        <w:tc>
-          <w:tcPr>
-            <w:tcW w:type="dxa" w:w="1474"/>
+            <w:tcW w:type="dxa" w:w="1361"/>
           </w:tcPr>
           <w:p>
             <w:pPr>
@@ -730,11 +658,27 @@
             </w:r>
           </w:p>
         </w:tc>
+        <w:tc>
+          <w:tcPr>
+            <w:tcW w:type="dxa" w:w="1020"/>
+          </w:tcPr>
+          <w:p>
+            <w:pPr>
+              <w:jc w:val="right"/>
+            </w:pPr>
+            <w:r/>
+            <w:r>
+              <w:rPr>
+                <w:sz w:val="19"/>
+              </w:rPr>
+            </w:r>
+          </w:p>
+        </w:tc>
       </w:tr>
       <w:tr>
         <w:tc>
           <w:tcPr>
-            <w:tcW w:type="dxa" w:w="5386"/>
+            <w:tcW w:type="dxa" w:w="5443"/>
           </w:tcPr>
           <w:p>
             <w:r/>
@@ -749,7 +693,7 @@
         </w:tc>
         <w:tc>
           <w:tcPr>
-            <w:tcW w:type="dxa" w:w="1474"/>
+            <w:tcW w:type="dxa" w:w="1361"/>
           </w:tcPr>
           <w:p>
             <w:pPr>
@@ -761,13 +705,13 @@
                 <w:b/>
                 <w:sz w:val="19"/>
               </w:rPr>
-              <w:t>365 000</w:t>
+              <w:t>335 833</w:t>
             </w:r>
           </w:p>
         </w:tc>
         <w:tc>
           <w:tcPr>
-            <w:tcW w:type="dxa" w:w="1247"/>
+            <w:tcW w:type="dxa" w:w="1361"/>
           </w:tcPr>
           <w:p>
             <w:pPr>
@@ -779,13 +723,13 @@
                 <w:b/>
                 <w:sz w:val="19"/>
               </w:rPr>
-              <w:t>73 000</w:t>
+              <w:t>403 000</w:t>
             </w:r>
           </w:p>
         </w:tc>
         <w:tc>
           <w:tcPr>
-            <w:tcW w:type="dxa" w:w="1474"/>
+            <w:tcW w:type="dxa" w:w="1020"/>
           </w:tcPr>
           <w:p>
             <w:pPr>
@@ -797,7 +741,7 @@
                 <w:b/>
                 <w:sz w:val="19"/>
               </w:rPr>
-              <w:t>438 000</w:t>
+              <w:t>36,9 %</w:t>
             </w:r>
           </w:p>
         </w:tc>
@@ -805,7 +749,7 @@
       <w:tr>
         <w:tc>
           <w:tcPr>
-            <w:tcW w:type="dxa" w:w="5386"/>
+            <w:tcW w:type="dxa" w:w="5443"/>
           </w:tcPr>
           <w:p>
             <w:r/>
@@ -819,7 +763,7 @@
         </w:tc>
         <w:tc>
           <w:tcPr>
-            <w:tcW w:type="dxa" w:w="1474"/>
+            <w:tcW w:type="dxa" w:w="1361"/>
           </w:tcPr>
           <w:p>
             <w:pPr>
@@ -836,24 +780,7 @@
         </w:tc>
         <w:tc>
           <w:tcPr>
-            <w:tcW w:type="dxa" w:w="1247"/>
-          </w:tcPr>
-          <w:p>
-            <w:pPr>
-              <w:jc w:val="right"/>
-            </w:pPr>
-            <w:r/>
-            <w:r>
-              <w:rPr>
-                <w:sz w:val="19"/>
-              </w:rPr>
-              <w:t>23 333</w:t>
-            </w:r>
-          </w:p>
-        </w:tc>
-        <w:tc>
-          <w:tcPr>
-            <w:tcW w:type="dxa" w:w="1474"/>
+            <w:tcW w:type="dxa" w:w="1361"/>
           </w:tcPr>
           <w:p>
             <w:pPr>
@@ -868,11 +795,27 @@
             </w:r>
           </w:p>
         </w:tc>
+        <w:tc>
+          <w:tcPr>
+            <w:tcW w:type="dxa" w:w="1020"/>
+          </w:tcPr>
+          <w:p>
+            <w:pPr>
+              <w:jc w:val="right"/>
+            </w:pPr>
+            <w:r/>
+            <w:r>
+              <w:rPr>
+                <w:sz w:val="19"/>
+              </w:rPr>
+            </w:r>
+          </w:p>
+        </w:tc>
       </w:tr>
       <w:tr>
         <w:tc>
           <w:tcPr>
-            <w:tcW w:type="dxa" w:w="5386"/>
+            <w:tcW w:type="dxa" w:w="5443"/>
           </w:tcPr>
           <w:p>
             <w:r/>
@@ -886,7 +829,7 @@
         </w:tc>
         <w:tc>
           <w:tcPr>
-            <w:tcW w:type="dxa" w:w="1474"/>
+            <w:tcW w:type="dxa" w:w="1361"/>
           </w:tcPr>
           <w:p>
             <w:pPr>
@@ -903,24 +846,7 @@
         </w:tc>
         <w:tc>
           <w:tcPr>
-            <w:tcW w:type="dxa" w:w="1247"/>
-          </w:tcPr>
-          <w:p>
-            <w:pPr>
-              <w:jc w:val="right"/>
-            </w:pPr>
-            <w:r/>
-            <w:r>
-              <w:rPr>
-                <w:sz w:val="19"/>
-              </w:rPr>
-              <w:t>21 667</w:t>
-            </w:r>
-          </w:p>
-        </w:tc>
-        <w:tc>
-          <w:tcPr>
-            <w:tcW w:type="dxa" w:w="1474"/>
+            <w:tcW w:type="dxa" w:w="1361"/>
           </w:tcPr>
           <w:p>
             <w:pPr>
@@ -935,11 +861,27 @@
             </w:r>
           </w:p>
         </w:tc>
+        <w:tc>
+          <w:tcPr>
+            <w:tcW w:type="dxa" w:w="1020"/>
+          </w:tcPr>
+          <w:p>
+            <w:pPr>
+              <w:jc w:val="right"/>
+            </w:pPr>
+            <w:r/>
+            <w:r>
+              <w:rPr>
+                <w:sz w:val="19"/>
+              </w:rPr>
+            </w:r>
+          </w:p>
+        </w:tc>
       </w:tr>
       <w:tr>
         <w:tc>
           <w:tcPr>
-            <w:tcW w:type="dxa" w:w="5386"/>
+            <w:tcW w:type="dxa" w:w="5443"/>
           </w:tcPr>
           <w:p>
             <w:r/>
@@ -953,7 +895,7 @@
         </w:tc>
         <w:tc>
           <w:tcPr>
-            <w:tcW w:type="dxa" w:w="1474"/>
+            <w:tcW w:type="dxa" w:w="1361"/>
           </w:tcPr>
           <w:p>
             <w:pPr>
@@ -970,24 +912,7 @@
         </w:tc>
         <w:tc>
           <w:tcPr>
-            <w:tcW w:type="dxa" w:w="1247"/>
-          </w:tcPr>
-          <w:p>
-            <w:pPr>
-              <w:jc w:val="right"/>
-            </w:pPr>
-            <w:r/>
-            <w:r>
-              <w:rPr>
-                <w:sz w:val="19"/>
-              </w:rPr>
-              <w:t>3 000</w:t>
-            </w:r>
-          </w:p>
-        </w:tc>
-        <w:tc>
-          <w:tcPr>
-            <w:tcW w:type="dxa" w:w="1474"/>
+            <w:tcW w:type="dxa" w:w="1361"/>
           </w:tcPr>
           <w:p>
             <w:pPr>
@@ -1002,11 +927,27 @@
             </w:r>
           </w:p>
         </w:tc>
+        <w:tc>
+          <w:tcPr>
+            <w:tcW w:type="dxa" w:w="1020"/>
+          </w:tcPr>
+          <w:p>
+            <w:pPr>
+              <w:jc w:val="right"/>
+            </w:pPr>
+            <w:r/>
+            <w:r>
+              <w:rPr>
+                <w:sz w:val="19"/>
+              </w:rPr>
+            </w:r>
+          </w:p>
+        </w:tc>
       </w:tr>
       <w:tr>
         <w:tc>
           <w:tcPr>
-            <w:tcW w:type="dxa" w:w="5386"/>
+            <w:tcW w:type="dxa" w:w="5443"/>
           </w:tcPr>
           <w:p>
             <w:r/>
@@ -1020,7 +961,7 @@
         </w:tc>
         <w:tc>
           <w:tcPr>
-            <w:tcW w:type="dxa" w:w="1474"/>
+            <w:tcW w:type="dxa" w:w="1361"/>
           </w:tcPr>
           <w:p>
             <w:pPr>
@@ -1037,24 +978,7 @@
         </w:tc>
         <w:tc>
           <w:tcPr>
-            <w:tcW w:type="dxa" w:w="1247"/>
-          </w:tcPr>
-          <w:p>
-            <w:pPr>
-              <w:jc w:val="right"/>
-            </w:pPr>
-            <w:r/>
-            <w:r>
-              <w:rPr>
-                <w:sz w:val="19"/>
-              </w:rPr>
-              <w:t>7 500</w:t>
-            </w:r>
-          </w:p>
-        </w:tc>
-        <w:tc>
-          <w:tcPr>
-            <w:tcW w:type="dxa" w:w="1474"/>
+            <w:tcW w:type="dxa" w:w="1361"/>
           </w:tcPr>
           <w:p>
             <w:pPr>
@@ -1069,11 +993,27 @@
             </w:r>
           </w:p>
         </w:tc>
+        <w:tc>
+          <w:tcPr>
+            <w:tcW w:type="dxa" w:w="1020"/>
+          </w:tcPr>
+          <w:p>
+            <w:pPr>
+              <w:jc w:val="right"/>
+            </w:pPr>
+            <w:r/>
+            <w:r>
+              <w:rPr>
+                <w:sz w:val="19"/>
+              </w:rPr>
+            </w:r>
+          </w:p>
+        </w:tc>
       </w:tr>
       <w:tr>
         <w:tc>
           <w:tcPr>
-            <w:tcW w:type="dxa" w:w="5386"/>
+            <w:tcW w:type="dxa" w:w="5443"/>
           </w:tcPr>
           <w:p>
             <w:r/>
@@ -1081,13 +1021,13 @@
               <w:rPr>
                 <w:sz w:val="19"/>
               </w:rPr>
-              <w:t xml:space="preserve">  · Installation solaire</w:t>
+              <w:t xml:space="preserve">  · Installation solaire + pompe</w:t>
             </w:r>
           </w:p>
         </w:tc>
         <w:tc>
           <w:tcPr>
-            <w:tcW w:type="dxa" w:w="1474"/>
+            <w:tcW w:type="dxa" w:w="1361"/>
           </w:tcPr>
           <w:p>
             <w:pPr>
@@ -1104,24 +1044,7 @@
         </w:tc>
         <w:tc>
           <w:tcPr>
-            <w:tcW w:type="dxa" w:w="1247"/>
-          </w:tcPr>
-          <w:p>
-            <w:pPr>
-              <w:jc w:val="right"/>
-            </w:pPr>
-            <w:r/>
-            <w:r>
-              <w:rPr>
-                <w:sz w:val="19"/>
-              </w:rPr>
-              <w:t>11 667</w:t>
-            </w:r>
-          </w:p>
-        </w:tc>
-        <w:tc>
-          <w:tcPr>
-            <w:tcW w:type="dxa" w:w="1474"/>
+            <w:tcW w:type="dxa" w:w="1361"/>
           </w:tcPr>
           <w:p>
             <w:pPr>
@@ -1136,25 +1059,9 @@
             </w:r>
           </w:p>
         </w:tc>
-      </w:tr>
-      <w:tr>
         <w:tc>
           <w:tcPr>
-            <w:tcW w:type="dxa" w:w="5386"/>
-          </w:tcPr>
-          <w:p>
-            <w:r/>
-            <w:r>
-              <w:rPr>
-                <w:sz w:val="19"/>
-              </w:rPr>
-              <w:t xml:space="preserve">  · Pompe + équipement hydraulique (ex-puits)</w:t>
-            </w:r>
-          </w:p>
-        </w:tc>
-        <w:tc>
-          <w:tcPr>
-            <w:tcW w:type="dxa" w:w="1474"/>
+            <w:tcW w:type="dxa" w:w="1020"/>
           </w:tcPr>
           <w:p>
             <w:pPr>
@@ -1165,41 +1072,6 @@
               <w:rPr>
                 <w:sz w:val="19"/>
               </w:rPr>
-              <w:t>29 167</w:t>
-            </w:r>
-          </w:p>
-        </w:tc>
-        <w:tc>
-          <w:tcPr>
-            <w:tcW w:type="dxa" w:w="1247"/>
-          </w:tcPr>
-          <w:p>
-            <w:pPr>
-              <w:jc w:val="right"/>
-            </w:pPr>
-            <w:r/>
-            <w:r>
-              <w:rPr>
-                <w:sz w:val="19"/>
-              </w:rPr>
-              <w:t>5 833</w:t>
-            </w:r>
-          </w:p>
-        </w:tc>
-        <w:tc>
-          <w:tcPr>
-            <w:tcW w:type="dxa" w:w="1474"/>
-          </w:tcPr>
-          <w:p>
-            <w:pPr>
-              <w:jc w:val="right"/>
-            </w:pPr>
-            <w:r/>
-            <w:r>
-              <w:rPr>
-                <w:sz w:val="19"/>
-              </w:rPr>
-              <w:t>35 000</w:t>
             </w:r>
           </w:p>
         </w:tc>
@@ -1207,7 +1079,7 @@
       <w:tr>
         <w:tc>
           <w:tcPr>
-            <w:tcW w:type="dxa" w:w="5386"/>
+            <w:tcW w:type="dxa" w:w="5443"/>
           </w:tcPr>
           <w:p>
             <w:r/>
@@ -1222,7 +1094,7 @@
         </w:tc>
         <w:tc>
           <w:tcPr>
-            <w:tcW w:type="dxa" w:w="1474"/>
+            <w:tcW w:type="dxa" w:w="1361"/>
           </w:tcPr>
           <w:p>
             <w:pPr>
@@ -1240,25 +1112,7 @@
         </w:tc>
         <w:tc>
           <w:tcPr>
-            <w:tcW w:type="dxa" w:w="1247"/>
-          </w:tcPr>
-          <w:p>
-            <w:pPr>
-              <w:jc w:val="right"/>
-            </w:pPr>
-            <w:r/>
-            <w:r>
-              <w:rPr>
-                <w:b/>
-                <w:sz w:val="19"/>
-              </w:rPr>
-              <w:t>6 333</w:t>
-            </w:r>
-          </w:p>
-        </w:tc>
-        <w:tc>
-          <w:tcPr>
-            <w:tcW w:type="dxa" w:w="1474"/>
+            <w:tcW w:type="dxa" w:w="1361"/>
           </w:tcPr>
           <w:p>
             <w:pPr>
@@ -1274,25 +1128,9 @@
             </w:r>
           </w:p>
         </w:tc>
-      </w:tr>
-      <w:tr>
         <w:tc>
           <w:tcPr>
-            <w:tcW w:type="dxa" w:w="5386"/>
-          </w:tcPr>
-          <w:p>
-            <w:r/>
-            <w:r>
-              <w:rPr>
-                <w:sz w:val="19"/>
-              </w:rPr>
-              <w:t xml:space="preserve">  · Constitution, études, BP, autorisations</w:t>
-            </w:r>
-          </w:p>
-        </w:tc>
-        <w:tc>
-          <w:tcPr>
-            <w:tcW w:type="dxa" w:w="1474"/>
+            <w:tcW w:type="dxa" w:w="1020"/>
           </w:tcPr>
           <w:p>
             <w:pPr>
@@ -1301,43 +1139,10 @@
             <w:r/>
             <w:r>
               <w:rPr>
+                <w:b/>
                 <w:sz w:val="19"/>
               </w:rPr>
-              <w:t>31 667</w:t>
-            </w:r>
-          </w:p>
-        </w:tc>
-        <w:tc>
-          <w:tcPr>
-            <w:tcW w:type="dxa" w:w="1247"/>
-          </w:tcPr>
-          <w:p>
-            <w:pPr>
-              <w:jc w:val="right"/>
-            </w:pPr>
-            <w:r/>
-            <w:r>
-              <w:rPr>
-                <w:sz w:val="19"/>
-              </w:rPr>
-              <w:t>6 333</w:t>
-            </w:r>
-          </w:p>
-        </w:tc>
-        <w:tc>
-          <w:tcPr>
-            <w:tcW w:type="dxa" w:w="1474"/>
-          </w:tcPr>
-          <w:p>
-            <w:pPr>
-              <w:jc w:val="right"/>
-            </w:pPr>
-            <w:r/>
-            <w:r>
-              <w:rPr>
-                <w:sz w:val="19"/>
-              </w:rPr>
-              <w:t>38 000</w:t>
+              <w:t>3,5 %</w:t>
             </w:r>
           </w:p>
         </w:tc>
@@ -1345,7 +1150,7 @@
       <w:tr>
         <w:tc>
           <w:tcPr>
-            <w:tcW w:type="dxa" w:w="5386"/>
+            <w:tcW w:type="dxa" w:w="5443"/>
           </w:tcPr>
           <w:p>
             <w:r/>
@@ -1360,7 +1165,7 @@
         </w:tc>
         <w:tc>
           <w:tcPr>
-            <w:tcW w:type="dxa" w:w="1474"/>
+            <w:tcW w:type="dxa" w:w="1361"/>
           </w:tcPr>
           <w:p>
             <w:pPr>
@@ -1378,25 +1183,7 @@
         </w:tc>
         <w:tc>
           <w:tcPr>
-            <w:tcW w:type="dxa" w:w="1247"/>
-          </w:tcPr>
-          <w:p>
-            <w:pPr>
-              <w:jc w:val="right"/>
-            </w:pPr>
-            <w:r/>
-            <w:r>
-              <w:rPr>
-                <w:b/>
-                <w:sz w:val="19"/>
-              </w:rPr>
-              <w:t>1 667</w:t>
-            </w:r>
-          </w:p>
-        </w:tc>
-        <w:tc>
-          <w:tcPr>
-            <w:tcW w:type="dxa" w:w="1474"/>
+            <w:tcW w:type="dxa" w:w="1361"/>
           </w:tcPr>
           <w:p>
             <w:pPr>
@@ -1412,25 +1199,9 @@
             </w:r>
           </w:p>
         </w:tc>
-      </w:tr>
-      <w:tr>
         <w:tc>
           <w:tcPr>
-            <w:tcW w:type="dxa" w:w="5386"/>
-          </w:tcPr>
-          <w:p>
-            <w:r/>
-            <w:r>
-              <w:rPr>
-                <w:sz w:val="19"/>
-              </w:rPr>
-              <w:t xml:space="preserve">  · Divers et imprévus (adossés au programme)</w:t>
-            </w:r>
-          </w:p>
-        </w:tc>
-        <w:tc>
-          <w:tcPr>
-            <w:tcW w:type="dxa" w:w="1474"/>
+            <w:tcW w:type="dxa" w:w="1020"/>
           </w:tcPr>
           <w:p>
             <w:pPr>
@@ -1439,43 +1210,10 @@
             <w:r/>
             <w:r>
               <w:rPr>
+                <w:b/>
                 <w:sz w:val="19"/>
               </w:rPr>
-              <w:t>8 333</w:t>
-            </w:r>
-          </w:p>
-        </w:tc>
-        <w:tc>
-          <w:tcPr>
-            <w:tcW w:type="dxa" w:w="1247"/>
-          </w:tcPr>
-          <w:p>
-            <w:pPr>
-              <w:jc w:val="right"/>
-            </w:pPr>
-            <w:r/>
-            <w:r>
-              <w:rPr>
-                <w:sz w:val="19"/>
-              </w:rPr>
-              <w:t>1 667</w:t>
-            </w:r>
-          </w:p>
-        </w:tc>
-        <w:tc>
-          <w:tcPr>
-            <w:tcW w:type="dxa" w:w="1474"/>
-          </w:tcPr>
-          <w:p>
-            <w:pPr>
-              <w:jc w:val="right"/>
-            </w:pPr>
-            <w:r/>
-            <w:r>
-              <w:rPr>
-                <w:sz w:val="19"/>
-              </w:rPr>
-              <w:t>10 000</w:t>
+              <w:t>0,9 %</w:t>
             </w:r>
           </w:p>
         </w:tc>
@@ -1483,7 +1221,7 @@
       <w:tr>
         <w:tc>
           <w:tcPr>
-            <w:tcW w:type="dxa" w:w="5386"/>
+            <w:tcW w:type="dxa" w:w="5443"/>
           </w:tcPr>
           <w:p>
             <w:r/>
@@ -1498,7 +1236,7 @@
         </w:tc>
         <w:tc>
           <w:tcPr>
-            <w:tcW w:type="dxa" w:w="1474"/>
+            <w:tcW w:type="dxa" w:w="1361"/>
           </w:tcPr>
           <w:p>
             <w:pPr>
@@ -1516,25 +1254,7 @@
         </w:tc>
         <w:tc>
           <w:tcPr>
-            <w:tcW w:type="dxa" w:w="1247"/>
-          </w:tcPr>
-          <w:p>
-            <w:pPr>
-              <w:jc w:val="right"/>
-            </w:pPr>
-            <w:r/>
-            <w:r>
-              <w:rPr>
-                <w:b/>
-                <w:sz w:val="19"/>
-              </w:rPr>
-              <w:t>161 833</w:t>
-            </w:r>
-          </w:p>
-        </w:tc>
-        <w:tc>
-          <w:tcPr>
-            <w:tcW w:type="dxa" w:w="1474"/>
+            <w:tcW w:type="dxa" w:w="1361"/>
           </w:tcPr>
           <w:p>
             <w:pPr>
@@ -1547,6 +1267,24 @@
                 <w:sz w:val="19"/>
               </w:rPr>
               <w:t>971 000</w:t>
+            </w:r>
+          </w:p>
+        </w:tc>
+        <w:tc>
+          <w:tcPr>
+            <w:tcW w:type="dxa" w:w="1020"/>
+          </w:tcPr>
+          <w:p>
+            <w:pPr>
+              <w:jc w:val="right"/>
+            </w:pPr>
+            <w:r/>
+            <w:r>
+              <w:rPr>
+                <w:b/>
+                <w:sz w:val="19"/>
+              </w:rPr>
+              <w:t>89,0 %</w:t>
             </w:r>
           </w:p>
         </w:tc>
@@ -1567,7 +1305,7 @@
     </w:p>
     <w:p>
       <w:pPr>
-        <w:spacing w:after="120" w:before="200"/>
+        <w:spacing w:before="240" w:after="120"/>
       </w:pPr>
       <w:r>
         <w:rPr>
@@ -1575,7 +1313,7 @@
           <w:color w:val="1B3A28"/>
           <w:sz w:val="30"/>
         </w:rPr>
-        <w:t>3. Postes hors primable (autofinancés)</w:t>
+        <w:t>2. Postes hors primable (autofinancés)</w:t>
       </w:r>
     </w:p>
     <w:tbl>
@@ -1586,15 +1324,14 @@
         <w:tblLook w:firstColumn="1" w:firstRow="1" w:lastColumn="0" w:lastRow="0" w:noHBand="0" w:noVBand="1" w:val="04A0"/>
       </w:tblPr>
       <w:tblGrid>
-        <w:gridCol w:w="2160"/>
-        <w:gridCol w:w="2160"/>
-        <w:gridCol w:w="2160"/>
-        <w:gridCol w:w="2160"/>
+        <w:gridCol w:w="2880"/>
+        <w:gridCol w:w="2880"/>
+        <w:gridCol w:w="2880"/>
       </w:tblGrid>
       <w:tr>
         <w:tc>
           <w:tcPr>
-            <w:tcW w:type="dxa" w:w="5386"/>
+            <w:tcW w:type="dxa" w:w="5669"/>
             <w:shd w:fill="1B3A28"/>
           </w:tcPr>
           <w:p>
@@ -1611,7 +1348,7 @@
         </w:tc>
         <w:tc>
           <w:tcPr>
-            <w:tcW w:type="dxa" w:w="1474"/>
+            <w:tcW w:type="dxa" w:w="1701"/>
             <w:shd w:fill="1B3A28"/>
           </w:tcPr>
           <w:p>
@@ -1622,13 +1359,13 @@
                 <w:color w:val="FFFFFF"/>
                 <w:sz w:val="19"/>
               </w:rPr>
-              <w:t>HT (DH)</w:t>
+              <w:t>HT</w:t>
             </w:r>
           </w:p>
         </w:tc>
         <w:tc>
           <w:tcPr>
-            <w:tcW w:type="dxa" w:w="1247"/>
+            <w:tcW w:type="dxa" w:w="1701"/>
             <w:shd w:fill="1B3A28"/>
           </w:tcPr>
           <w:p>
@@ -1639,24 +1376,7 @@
                 <w:color w:val="FFFFFF"/>
                 <w:sz w:val="19"/>
               </w:rPr>
-              <w:t>TVA 20%</w:t>
-            </w:r>
-          </w:p>
-        </w:tc>
-        <w:tc>
-          <w:tcPr>
-            <w:tcW w:type="dxa" w:w="1474"/>
-            <w:shd w:fill="1B3A28"/>
-          </w:tcPr>
-          <w:p>
-            <w:r/>
-            <w:r>
-              <w:rPr>
-                <w:b/>
-                <w:color w:val="FFFFFF"/>
-                <w:sz w:val="19"/>
-              </w:rPr>
-              <w:t>TTC (DH)</w:t>
+              <w:t>TTC</w:t>
             </w:r>
           </w:p>
         </w:tc>
@@ -1664,7 +1384,7 @@
       <w:tr>
         <w:tc>
           <w:tcPr>
-            <w:tcW w:type="dxa" w:w="5386"/>
+            <w:tcW w:type="dxa" w:w="5669"/>
           </w:tcPr>
           <w:p>
             <w:r/>
@@ -1672,13 +1392,13 @@
               <w:rPr>
                 <w:sz w:val="19"/>
               </w:rPr>
-              <w:t>Piscine (prestation complémentaire de détente)</w:t>
+              <w:t>Piscine (prestation complémentaire)</w:t>
             </w:r>
           </w:p>
         </w:tc>
         <w:tc>
           <w:tcPr>
-            <w:tcW w:type="dxa" w:w="1474"/>
+            <w:tcW w:type="dxa" w:w="1701"/>
           </w:tcPr>
           <w:p>
             <w:pPr>
@@ -1695,24 +1415,7 @@
         </w:tc>
         <w:tc>
           <w:tcPr>
-            <w:tcW w:type="dxa" w:w="1247"/>
-          </w:tcPr>
-          <w:p>
-            <w:pPr>
-              <w:jc w:val="right"/>
-            </w:pPr>
-            <w:r/>
-            <w:r>
-              <w:rPr>
-                <w:sz w:val="19"/>
-              </w:rPr>
-              <w:t>16 667</w:t>
-            </w:r>
-          </w:p>
-        </w:tc>
-        <w:tc>
-          <w:tcPr>
-            <w:tcW w:type="dxa" w:w="1474"/>
+            <w:tcW w:type="dxa" w:w="1701"/>
           </w:tcPr>
           <w:p>
             <w:pPr>
@@ -1731,7 +1434,7 @@
       <w:tr>
         <w:tc>
           <w:tcPr>
-            <w:tcW w:type="dxa" w:w="5386"/>
+            <w:tcW w:type="dxa" w:w="5669"/>
           </w:tcPr>
           <w:p>
             <w:r/>
@@ -1739,13 +1442,13 @@
               <w:rPr>
                 <w:sz w:val="19"/>
               </w:rPr>
-              <w:t>BFR / fonds de roulement de démarrage</w:t>
+              <w:t>BFR / fonds de roulement</w:t>
             </w:r>
           </w:p>
         </w:tc>
         <w:tc>
           <w:tcPr>
-            <w:tcW w:type="dxa" w:w="1474"/>
+            <w:tcW w:type="dxa" w:w="1701"/>
           </w:tcPr>
           <w:p>
             <w:pPr>
@@ -1762,24 +1465,7 @@
         </w:tc>
         <w:tc>
           <w:tcPr>
-            <w:tcW w:type="dxa" w:w="1247"/>
-          </w:tcPr>
-          <w:p>
-            <w:pPr>
-              <w:jc w:val="right"/>
-            </w:pPr>
-            <w:r/>
-            <w:r>
-              <w:rPr>
-                <w:sz w:val="19"/>
-              </w:rPr>
-              <w:t>—</w:t>
-            </w:r>
-          </w:p>
-        </w:tc>
-        <w:tc>
-          <w:tcPr>
-            <w:tcW w:type="dxa" w:w="1474"/>
+            <w:tcW w:type="dxa" w:w="1701"/>
           </w:tcPr>
           <w:p>
             <w:pPr>
@@ -1798,7 +1484,7 @@
       <w:tr>
         <w:tc>
           <w:tcPr>
-            <w:tcW w:type="dxa" w:w="5386"/>
+            <w:tcW w:type="dxa" w:w="5669"/>
           </w:tcPr>
           <w:p>
             <w:r/>
@@ -1813,7 +1499,7 @@
         </w:tc>
         <w:tc>
           <w:tcPr>
-            <w:tcW w:type="dxa" w:w="1474"/>
+            <w:tcW w:type="dxa" w:w="1701"/>
           </w:tcPr>
           <w:p>
             <w:pPr>
@@ -1830,24 +1516,7 @@
         </w:tc>
         <w:tc>
           <w:tcPr>
-            <w:tcW w:type="dxa" w:w="1247"/>
-          </w:tcPr>
-          <w:p>
-            <w:pPr>
-              <w:jc w:val="right"/>
-            </w:pPr>
-            <w:r/>
-            <w:r>
-              <w:rPr>
-                <w:b/>
-                <w:sz w:val="19"/>
-              </w:rPr>
-            </w:r>
-          </w:p>
-        </w:tc>
-        <w:tc>
-          <w:tcPr>
-            <w:tcW w:type="dxa" w:w="1474"/>
+            <w:tcW w:type="dxa" w:w="1701"/>
           </w:tcPr>
           <w:p>
             <w:pPr>
@@ -1867,20 +1536,7 @@
     </w:tbl>
     <w:p>
       <w:pPr>
-        <w:spacing w:after="80"/>
-      </w:pPr>
-      <w:r>
-        <w:rPr>
-          <w:b w:val="0"/>
-          <w:color w:val="555555"/>
-          <w:sz w:val="19"/>
-        </w:rPr>
-        <w:t>La piscine est expressément exclue de l'assiette primable (projet non ciblé au sens du règlement). Elle reste un argument commercial et est financée sur fonds propres.</w:t>
-      </w:r>
-    </w:p>
-    <w:p>
-      <w:pPr>
-        <w:spacing w:after="120" w:before="200"/>
+        <w:spacing w:before="240" w:after="120"/>
       </w:pPr>
       <w:r>
         <w:rPr>
@@ -1888,7 +1544,7 @@
           <w:color w:val="1B3A28"/>
           <w:sz w:val="30"/>
         </w:rPr>
-        <w:t>4. Prime probable par rubrique et contrôle des plafonds</w:t>
+        <w:t>3. Prime par rubrique &amp; contrôle des plafonds</w:t>
       </w:r>
     </w:p>
     <w:tbl>
@@ -1926,7 +1582,7 @@
         </w:tc>
         <w:tc>
           <w:tcPr>
-            <w:tcW w:type="dxa" w:w="1304"/>
+            <w:tcW w:type="dxa" w:w="1247"/>
             <w:shd w:fill="1B3A28"/>
           </w:tcPr>
           <w:p>
@@ -1943,7 +1599,7 @@
         </w:tc>
         <w:tc>
           <w:tcPr>
-            <w:tcW w:type="dxa" w:w="1701"/>
+            <w:tcW w:type="dxa" w:w="1587"/>
             <w:shd w:fill="1B3A28"/>
           </w:tcPr>
           <w:p>
@@ -1960,7 +1616,7 @@
         </w:tc>
         <w:tc>
           <w:tcPr>
-            <w:tcW w:type="dxa" w:w="1020"/>
+            <w:tcW w:type="dxa" w:w="907"/>
             <w:shd w:fill="1B3A28"/>
           </w:tcPr>
           <w:p>
@@ -1977,7 +1633,7 @@
         </w:tc>
         <w:tc>
           <w:tcPr>
-            <w:tcW w:type="dxa" w:w="1247"/>
+            <w:tcW w:type="dxa" w:w="1134"/>
             <w:shd w:fill="1B3A28"/>
           </w:tcPr>
           <w:p>
@@ -1988,7 +1644,7 @@
                 <w:color w:val="FFFFFF"/>
                 <w:sz w:val="19"/>
               </w:rPr>
-              <w:t>Prime (35%)</w:t>
+              <w:t>Prime 35%</w:t>
             </w:r>
           </w:p>
         </w:tc>
@@ -2027,7 +1683,7 @@
         </w:tc>
         <w:tc>
           <w:tcPr>
-            <w:tcW w:type="dxa" w:w="1304"/>
+            <w:tcW w:type="dxa" w:w="1247"/>
           </w:tcPr>
           <w:p>
             <w:pPr>
@@ -2044,7 +1700,7 @@
         </w:tc>
         <w:tc>
           <w:tcPr>
-            <w:tcW w:type="dxa" w:w="1701"/>
+            <w:tcW w:type="dxa" w:w="1587"/>
           </w:tcPr>
           <w:p>
             <w:pPr>
@@ -2055,13 +1711,13 @@
               <w:rPr>
                 <w:sz w:val="19"/>
               </w:rPr>
-              <w:t>≤ 5 % (avec divers)</w:t>
+              <w:t>≤5% (+divers)</w:t>
             </w:r>
           </w:p>
         </w:tc>
         <w:tc>
           <w:tcPr>
-            <w:tcW w:type="dxa" w:w="1020"/>
+            <w:tcW w:type="dxa" w:w="907"/>
           </w:tcPr>
           <w:p>
             <w:pPr>
@@ -2072,13 +1728,13 @@
               <w:rPr>
                 <w:sz w:val="19"/>
               </w:rPr>
-              <w:t>4,4 % combiné</w:t>
+              <w:t>4,4%</w:t>
             </w:r>
           </w:p>
         </w:tc>
         <w:tc>
           <w:tcPr>
-            <w:tcW w:type="dxa" w:w="1247"/>
+            <w:tcW w:type="dxa" w:w="1134"/>
           </w:tcPr>
           <w:p>
             <w:pPr>
@@ -2128,7 +1784,7 @@
         </w:tc>
         <w:tc>
           <w:tcPr>
-            <w:tcW w:type="dxa" w:w="1304"/>
+            <w:tcW w:type="dxa" w:w="1247"/>
           </w:tcPr>
           <w:p>
             <w:pPr>
@@ -2139,7 +1795,58 @@
               <w:rPr>
                 <w:sz w:val="19"/>
               </w:rPr>
-              <w:t>175 000</w:t>
+              <w:t>110 000</w:t>
+            </w:r>
+          </w:p>
+        </w:tc>
+        <w:tc>
+          <w:tcPr>
+            <w:tcW w:type="dxa" w:w="1587"/>
+          </w:tcPr>
+          <w:p>
+            <w:pPr>
+              <w:jc w:val="right"/>
+            </w:pPr>
+            <w:r/>
+            <w:r>
+              <w:rPr>
+                <w:sz w:val="19"/>
+              </w:rPr>
+              <w:t>≤20% projet</w:t>
+            </w:r>
+          </w:p>
+        </w:tc>
+        <w:tc>
+          <w:tcPr>
+            <w:tcW w:type="dxa" w:w="907"/>
+          </w:tcPr>
+          <w:p>
+            <w:pPr>
+              <w:jc w:val="right"/>
+            </w:pPr>
+            <w:r/>
+            <w:r>
+              <w:rPr>
+                <w:sz w:val="19"/>
+              </w:rPr>
+              <w:t>10,1%</w:t>
+            </w:r>
+          </w:p>
+        </w:tc>
+        <w:tc>
+          <w:tcPr>
+            <w:tcW w:type="dxa" w:w="1134"/>
+          </w:tcPr>
+          <w:p>
+            <w:pPr>
+              <w:jc w:val="right"/>
+            </w:pPr>
+            <w:r/>
+            <w:r>
+              <w:rPr>
+                <w:sz w:val="19"/>
+              </w:rPr>
+              <w:t>38 500</w:t>
             </w:r>
           </w:p>
         </w:tc>
@@ -2156,24 +1863,23 @@
               <w:rPr>
                 <w:sz w:val="19"/>
               </w:rPr>
-              <w:t>≤ 20 % du projet</w:t>
+              <w:t>Conforme (large marge)</w:t>
             </w:r>
           </w:p>
         </w:tc>
+      </w:tr>
+      <w:tr>
         <w:tc>
           <w:tcPr>
-            <w:tcW w:type="dxa" w:w="1020"/>
+            <w:tcW w:type="dxa" w:w="2041"/>
           </w:tcPr>
           <w:p>
-            <w:pPr>
-              <w:jc w:val="right"/>
-            </w:pPr>
             <w:r/>
             <w:r>
               <w:rPr>
                 <w:sz w:val="19"/>
               </w:rPr>
-              <w:t>16,0 %</w:t>
+              <w:t>Aménagement &amp; infrastructure</w:t>
             </w:r>
           </w:p>
         </w:tc>
@@ -2190,63 +1896,13 @@
               <w:rPr>
                 <w:sz w:val="19"/>
               </w:rPr>
-              <w:t>61 250</w:t>
+              <w:t>410 000</w:t>
             </w:r>
           </w:p>
         </w:tc>
         <w:tc>
           <w:tcPr>
-            <w:tcW w:type="dxa" w:w="1701"/>
-          </w:tcPr>
-          <w:p>
-            <w:pPr>
-              <w:jc w:val="right"/>
-            </w:pPr>
-            <w:r/>
-            <w:r>
-              <w:rPr>
-                <w:sz w:val="19"/>
-              </w:rPr>
-              <w:t>Conforme (marge confortable)</w:t>
-            </w:r>
-          </w:p>
-        </w:tc>
-      </w:tr>
-      <w:tr>
-        <w:tc>
-          <w:tcPr>
-            <w:tcW w:type="dxa" w:w="2041"/>
-          </w:tcPr>
-          <w:p>
-            <w:r/>
-            <w:r>
-              <w:rPr>
-                <w:sz w:val="19"/>
-              </w:rPr>
-              <w:t>Aménagement &amp; agencement</w:t>
-            </w:r>
-          </w:p>
-        </w:tc>
-        <w:tc>
-          <w:tcPr>
-            <w:tcW w:type="dxa" w:w="1304"/>
-          </w:tcPr>
-          <w:p>
-            <w:pPr>
-              <w:jc w:val="right"/>
-            </w:pPr>
-            <w:r/>
-            <w:r>
-              <w:rPr>
-                <w:sz w:val="19"/>
-              </w:rPr>
-              <w:t>310 000</w:t>
-            </w:r>
-          </w:p>
-        </w:tc>
-        <w:tc>
-          <w:tcPr>
-            <w:tcW w:type="dxa" w:w="1701"/>
+            <w:tcW w:type="dxa" w:w="1587"/>
           </w:tcPr>
           <w:p>
             <w:pPr>
@@ -2263,7 +1919,7 @@
         </w:tc>
         <w:tc>
           <w:tcPr>
-            <w:tcW w:type="dxa" w:w="1020"/>
+            <w:tcW w:type="dxa" w:w="907"/>
           </w:tcPr>
           <w:p>
             <w:pPr>
@@ -2274,13 +1930,13 @@
               <w:rPr>
                 <w:sz w:val="19"/>
               </w:rPr>
-              <w:t>28,4 %</w:t>
+              <w:t>37,6%</w:t>
             </w:r>
           </w:p>
         </w:tc>
         <w:tc>
           <w:tcPr>
-            <w:tcW w:type="dxa" w:w="1247"/>
+            <w:tcW w:type="dxa" w:w="1134"/>
           </w:tcPr>
           <w:p>
             <w:pPr>
@@ -2291,7 +1947,7 @@
               <w:rPr>
                 <w:sz w:val="19"/>
               </w:rPr>
-              <w:t>108 500</w:t>
+              <w:t>143 500</w:t>
             </w:r>
           </w:p>
         </w:tc>
@@ -2330,7 +1986,7 @@
         </w:tc>
         <w:tc>
           <w:tcPr>
-            <w:tcW w:type="dxa" w:w="1304"/>
+            <w:tcW w:type="dxa" w:w="1247"/>
           </w:tcPr>
           <w:p>
             <w:pPr>
@@ -2341,13 +1997,13 @@
               <w:rPr>
                 <w:sz w:val="19"/>
               </w:rPr>
-              <w:t>438 000</w:t>
+              <w:t>403 000</w:t>
             </w:r>
           </w:p>
         </w:tc>
         <w:tc>
           <w:tcPr>
-            <w:tcW w:type="dxa" w:w="1701"/>
+            <w:tcW w:type="dxa" w:w="1587"/>
           </w:tcPr>
           <w:p>
             <w:pPr>
@@ -2364,7 +2020,7 @@
         </w:tc>
         <w:tc>
           <w:tcPr>
-            <w:tcW w:type="dxa" w:w="1020"/>
+            <w:tcW w:type="dxa" w:w="907"/>
           </w:tcPr>
           <w:p>
             <w:pPr>
@@ -2375,13 +2031,13 @@
               <w:rPr>
                 <w:sz w:val="19"/>
               </w:rPr>
-              <w:t>40,1 %</w:t>
+              <w:t>36,9%</w:t>
             </w:r>
           </w:p>
         </w:tc>
         <w:tc>
           <w:tcPr>
-            <w:tcW w:type="dxa" w:w="1247"/>
+            <w:tcW w:type="dxa" w:w="1134"/>
           </w:tcPr>
           <w:p>
             <w:pPr>
@@ -2392,7 +2048,7 @@
               <w:rPr>
                 <w:sz w:val="19"/>
               </w:rPr>
-              <w:t>153 300</w:t>
+              <w:t>141 050</w:t>
             </w:r>
           </w:p>
         </w:tc>
@@ -2431,7 +2087,7 @@
         </w:tc>
         <w:tc>
           <w:tcPr>
-            <w:tcW w:type="dxa" w:w="1304"/>
+            <w:tcW w:type="dxa" w:w="1247"/>
           </w:tcPr>
           <w:p>
             <w:pPr>
@@ -2448,7 +2104,7 @@
         </w:tc>
         <w:tc>
           <w:tcPr>
-            <w:tcW w:type="dxa" w:w="1701"/>
+            <w:tcW w:type="dxa" w:w="1587"/>
           </w:tcPr>
           <w:p>
             <w:pPr>
@@ -2459,13 +2115,13 @@
               <w:rPr>
                 <w:sz w:val="19"/>
               </w:rPr>
-              <w:t>≤ 5 % (avec frais prélim.)</w:t>
+              <w:t>≤5% (+frais)</w:t>
             </w:r>
           </w:p>
         </w:tc>
         <w:tc>
           <w:tcPr>
-            <w:tcW w:type="dxa" w:w="1020"/>
+            <w:tcW w:type="dxa" w:w="907"/>
           </w:tcPr>
           <w:p>
             <w:pPr>
@@ -2476,13 +2132,13 @@
               <w:rPr>
                 <w:sz w:val="19"/>
               </w:rPr>
-              <w:t>4,4 % combiné</w:t>
+              <w:t>4,4%</w:t>
             </w:r>
           </w:p>
         </w:tc>
         <w:tc>
           <w:tcPr>
-            <w:tcW w:type="dxa" w:w="1247"/>
+            <w:tcW w:type="dxa" w:w="1134"/>
           </w:tcPr>
           <w:p>
             <w:pPr>
@@ -2533,7 +2189,7 @@
         </w:tc>
         <w:tc>
           <w:tcPr>
-            <w:tcW w:type="dxa" w:w="1304"/>
+            <w:tcW w:type="dxa" w:w="1247"/>
           </w:tcPr>
           <w:p>
             <w:pPr>
@@ -2551,7 +2207,7 @@
         </w:tc>
         <w:tc>
           <w:tcPr>
-            <w:tcW w:type="dxa" w:w="1701"/>
+            <w:tcW w:type="dxa" w:w="1587"/>
           </w:tcPr>
           <w:p>
             <w:pPr>
@@ -2569,7 +2225,7 @@
         </w:tc>
         <w:tc>
           <w:tcPr>
-            <w:tcW w:type="dxa" w:w="1020"/>
+            <w:tcW w:type="dxa" w:w="907"/>
           </w:tcPr>
           <w:p>
             <w:pPr>
@@ -2581,13 +2237,13 @@
                 <w:b/>
                 <w:sz w:val="19"/>
               </w:rPr>
-              <w:t>89,0 %</w:t>
+              <w:t>89,0%</w:t>
             </w:r>
           </w:p>
         </w:tc>
         <w:tc>
           <w:tcPr>
-            <w:tcW w:type="dxa" w:w="1247"/>
+            <w:tcW w:type="dxa" w:w="1134"/>
           </w:tcPr>
           <w:p>
             <w:pPr>
@@ -2625,20 +2281,7 @@
     </w:tbl>
     <w:p>
       <w:pPr>
-        <w:spacing w:after="80"/>
-      </w:pPr>
-      <w:r>
-        <w:rPr>
-          <w:b w:val="0"/>
-          <w:color w:val="555555"/>
-          <w:sz w:val="19"/>
-        </w:rPr>
-        <w:t>Lecture : aucune prime n'est perdue. Les rubriques Aménagement et Matériel ne sont soumises à aucun plafond. Le seul poste sensible — Constructions — est ramené à 16,0 % du projet (contre un plafond de 20 %), ce qui préserve une marge d'environ 43 000 DH avant tout risque de déclassement.</w:t>
-      </w:r>
-    </w:p>
-    <w:p>
-      <w:pPr>
-        <w:spacing w:after="120" w:before="200"/>
+        <w:spacing w:before="240" w:after="120"/>
       </w:pPr>
       <w:r>
         <w:rPr>
@@ -2646,7 +2289,7 @@
           <w:color w:val="1B3A28"/>
           <w:sz w:val="30"/>
         </w:rPr>
-        <w:t>5. Plan de financement (sans leasing)</w:t>
+        <w:t>4. Plan de financement (sans leasing)</w:t>
       </w:r>
     </w:p>
     <w:tbl>
@@ -2675,7 +2318,7 @@
                 <w:color w:val="FFFFFF"/>
                 <w:sz w:val="19"/>
               </w:rPr>
-              <w:t>Source de financement</w:t>
+              <w:t>Source</w:t>
             </w:r>
           </w:p>
         </w:tc>
@@ -2725,7 +2368,7 @@
               <w:rPr>
                 <w:sz w:val="19"/>
               </w:rPr>
-              <w:t>Prime GO SIYAHA (35 % du primable)</w:t>
+              <w:t>Prime GO SIYAHA (35% du primable)</w:t>
             </w:r>
           </w:p>
         </w:tc>
@@ -2759,7 +2402,7 @@
               <w:rPr>
                 <w:sz w:val="19"/>
               </w:rPr>
-              <w:t>31,1 %</w:t>
+              <w:t>31,1%</w:t>
             </w:r>
           </w:p>
         </w:tc>
@@ -2775,7 +2418,7 @@
               <w:rPr>
                 <w:sz w:val="19"/>
               </w:rPr>
-              <w:t>CMT bancaire — Al Barid Bank (50 % du primable)</w:t>
+              <w:t>CMT bancaire – Al Barid Bank (50% du primable)</w:t>
             </w:r>
           </w:p>
         </w:tc>
@@ -2809,7 +2452,7 @@
               <w:rPr>
                 <w:sz w:val="19"/>
               </w:rPr>
-              <w:t>44,5 %</w:t>
+              <w:t>44,5%</w:t>
             </w:r>
           </w:p>
         </w:tc>
@@ -2859,7 +2502,7 @@
               <w:rPr>
                 <w:sz w:val="19"/>
               </w:rPr>
-              <w:t>24,4 %</w:t>
+              <w:t>24,4%</w:t>
             </w:r>
           </w:p>
         </w:tc>
@@ -2912,7 +2555,1438 @@
                 <w:b/>
                 <w:sz w:val="19"/>
               </w:rPr>
-              <w:t>100 %</w:t>
+              <w:t>100%</w:t>
+            </w:r>
+          </w:p>
+        </w:tc>
+      </w:tr>
+    </w:tbl>
+    <w:p>
+      <w:pPr>
+        <w:spacing w:before="240" w:after="120"/>
+      </w:pPr>
+      <w:r>
+        <w:rPr>
+          <w:b/>
+          <w:color w:val="1B3A28"/>
+          <w:sz w:val="30"/>
+        </w:rPr>
+        <w:t>5. Cahier des travaux — Entreprise de construction &amp; aménagement</w:t>
+      </w:r>
+    </w:p>
+    <w:p>
+      <w:pPr>
+        <w:spacing w:after="80"/>
+      </w:pPr>
+      <w:r>
+        <w:rPr>
+          <w:b w:val="0"/>
+          <w:color w:val="555555"/>
+          <w:sz w:val="20"/>
+        </w:rPr>
+        <w:t>Périmètre des travaux de génie civil et d'aménagement à confier à l'entreprise (à chiffrer en devis). Total travaux : 350 000 DH TTC. Les équipements (tente, climatisation, mobilier, sonorisation, paintball, e-bikes, cuisine, solaire, pompe) relèvent de fournisseurs spécialisés et ne font pas partie de ce lot.</w:t>
+      </w:r>
+    </w:p>
+    <w:tbl>
+      <w:tblPr>
+        <w:tblStyle w:val="LightGrid-Accent1"/>
+        <w:tblW w:type="auto" w:w="0"/>
+        <w:jc w:val="center"/>
+        <w:tblLook w:firstColumn="1" w:firstRow="1" w:lastColumn="0" w:lastRow="0" w:noHBand="0" w:noVBand="1" w:val="04A0"/>
+      </w:tblPr>
+      <w:tblGrid>
+        <w:gridCol w:w="2160"/>
+        <w:gridCol w:w="2160"/>
+        <w:gridCol w:w="2160"/>
+        <w:gridCol w:w="2160"/>
+      </w:tblGrid>
+      <w:tr>
+        <w:tc>
+          <w:tcPr>
+            <w:tcW w:type="dxa" w:w="6236"/>
+            <w:shd w:fill="1B3A28"/>
+          </w:tcPr>
+          <w:p>
+            <w:r/>
+            <w:r>
+              <w:rPr>
+                <w:b/>
+                <w:color w:val="FFFFFF"/>
+                <w:sz w:val="19"/>
+              </w:rPr>
+              <w:t>Lot / Prestation</w:t>
+            </w:r>
+          </w:p>
+        </w:tc>
+        <w:tc>
+          <w:tcPr>
+            <w:tcW w:type="dxa" w:w="113"/>
+            <w:shd w:fill="1B3A28"/>
+          </w:tcPr>
+          <w:p>
+            <w:r/>
+            <w:r>
+              <w:rPr>
+                <w:b/>
+                <w:color w:val="FFFFFF"/>
+                <w:sz w:val="19"/>
+              </w:rPr>
+            </w:r>
+          </w:p>
+        </w:tc>
+        <w:tc>
+          <w:tcPr>
+            <w:tcW w:type="dxa" w:w="1247"/>
+            <w:shd w:fill="1B3A28"/>
+          </w:tcPr>
+          <w:p>
+            <w:r/>
+            <w:r>
+              <w:rPr>
+                <w:b/>
+                <w:color w:val="FFFFFF"/>
+                <w:sz w:val="19"/>
+              </w:rPr>
+              <w:t>HT (DH)</w:t>
+            </w:r>
+          </w:p>
+        </w:tc>
+        <w:tc>
+          <w:tcPr>
+            <w:tcW w:type="dxa" w:w="1361"/>
+            <w:shd w:fill="1B3A28"/>
+          </w:tcPr>
+          <w:p>
+            <w:r/>
+            <w:r>
+              <w:rPr>
+                <w:b/>
+                <w:color w:val="FFFFFF"/>
+                <w:sz w:val="19"/>
+              </w:rPr>
+              <w:t>TTC (DH)</w:t>
+            </w:r>
+          </w:p>
+        </w:tc>
+      </w:tr>
+      <w:tr>
+        <w:tc>
+          <w:tcPr>
+            <w:tcW w:type="dxa" w:w="6236"/>
+          </w:tcPr>
+          <w:p>
+            <w:r/>
+            <w:r>
+              <w:rPr>
+                <w:b/>
+                <w:sz w:val="19"/>
+              </w:rPr>
+              <w:t>LOT 1 — Terrassement &amp; VRD</w:t>
+            </w:r>
+          </w:p>
+        </w:tc>
+        <w:tc>
+          <w:tcPr>
+            <w:tcW w:type="dxa" w:w="113"/>
+          </w:tcPr>
+          <w:p>
+            <w:pPr>
+              <w:jc w:val="right"/>
+            </w:pPr>
+            <w:r/>
+            <w:r>
+              <w:rPr>
+                <w:b/>
+                <w:sz w:val="19"/>
+              </w:rPr>
+            </w:r>
+          </w:p>
+        </w:tc>
+        <w:tc>
+          <w:tcPr>
+            <w:tcW w:type="dxa" w:w="1247"/>
+          </w:tcPr>
+          <w:p>
+            <w:pPr>
+              <w:jc w:val="right"/>
+            </w:pPr>
+            <w:r/>
+            <w:r>
+              <w:rPr>
+                <w:b/>
+                <w:sz w:val="19"/>
+              </w:rPr>
+              <w:t>25 000</w:t>
+            </w:r>
+          </w:p>
+        </w:tc>
+        <w:tc>
+          <w:tcPr>
+            <w:tcW w:type="dxa" w:w="1361"/>
+          </w:tcPr>
+          <w:p>
+            <w:pPr>
+              <w:jc w:val="right"/>
+            </w:pPr>
+            <w:r/>
+            <w:r>
+              <w:rPr>
+                <w:b/>
+                <w:sz w:val="19"/>
+              </w:rPr>
+              <w:t>30 000</w:t>
+            </w:r>
+          </w:p>
+        </w:tc>
+      </w:tr>
+      <w:tr>
+        <w:tc>
+          <w:tcPr>
+            <w:tcW w:type="dxa" w:w="6236"/>
+          </w:tcPr>
+          <w:p>
+            <w:r/>
+            <w:r>
+              <w:rPr>
+                <w:sz w:val="19"/>
+              </w:rPr>
+              <w:t xml:space="preserve">  Décapage, nivellement, terrassement général du site</w:t>
+            </w:r>
+          </w:p>
+        </w:tc>
+        <w:tc>
+          <w:tcPr>
+            <w:tcW w:type="dxa" w:w="113"/>
+          </w:tcPr>
+          <w:p>
+            <w:pPr>
+              <w:jc w:val="right"/>
+            </w:pPr>
+            <w:r/>
+            <w:r>
+              <w:rPr>
+                <w:sz w:val="19"/>
+              </w:rPr>
+            </w:r>
+          </w:p>
+        </w:tc>
+        <w:tc>
+          <w:tcPr>
+            <w:tcW w:type="dxa" w:w="1247"/>
+          </w:tcPr>
+          <w:p>
+            <w:pPr>
+              <w:jc w:val="right"/>
+            </w:pPr>
+            <w:r/>
+            <w:r>
+              <w:rPr>
+                <w:sz w:val="19"/>
+              </w:rPr>
+            </w:r>
+          </w:p>
+        </w:tc>
+        <w:tc>
+          <w:tcPr>
+            <w:tcW w:type="dxa" w:w="1361"/>
+          </w:tcPr>
+          <w:p>
+            <w:pPr>
+              <w:jc w:val="right"/>
+            </w:pPr>
+            <w:r/>
+            <w:r>
+              <w:rPr>
+                <w:sz w:val="19"/>
+              </w:rPr>
+            </w:r>
+          </w:p>
+        </w:tc>
+      </w:tr>
+      <w:tr>
+        <w:tc>
+          <w:tcPr>
+            <w:tcW w:type="dxa" w:w="6236"/>
+          </w:tcPr>
+          <w:p>
+            <w:r/>
+            <w:r>
+              <w:rPr>
+                <w:sz w:val="19"/>
+              </w:rPr>
+              <w:t xml:space="preserve">  Plateformes (bâtiment, tente, zones d'activité), tranchées réseaux</w:t>
+            </w:r>
+          </w:p>
+        </w:tc>
+        <w:tc>
+          <w:tcPr>
+            <w:tcW w:type="dxa" w:w="113"/>
+          </w:tcPr>
+          <w:p>
+            <w:pPr>
+              <w:jc w:val="right"/>
+            </w:pPr>
+            <w:r/>
+            <w:r>
+              <w:rPr>
+                <w:sz w:val="19"/>
+              </w:rPr>
+            </w:r>
+          </w:p>
+        </w:tc>
+        <w:tc>
+          <w:tcPr>
+            <w:tcW w:type="dxa" w:w="1247"/>
+          </w:tcPr>
+          <w:p>
+            <w:pPr>
+              <w:jc w:val="right"/>
+            </w:pPr>
+            <w:r/>
+            <w:r>
+              <w:rPr>
+                <w:sz w:val="19"/>
+              </w:rPr>
+            </w:r>
+          </w:p>
+        </w:tc>
+        <w:tc>
+          <w:tcPr>
+            <w:tcW w:type="dxa" w:w="1361"/>
+          </w:tcPr>
+          <w:p>
+            <w:pPr>
+              <w:jc w:val="right"/>
+            </w:pPr>
+            <w:r/>
+            <w:r>
+              <w:rPr>
+                <w:sz w:val="19"/>
+              </w:rPr>
+            </w:r>
+          </w:p>
+        </w:tc>
+      </w:tr>
+      <w:tr>
+        <w:tc>
+          <w:tcPr>
+            <w:tcW w:type="dxa" w:w="6236"/>
+          </w:tcPr>
+          <w:p>
+            <w:r/>
+            <w:r>
+              <w:rPr>
+                <w:b/>
+                <w:sz w:val="19"/>
+              </w:rPr>
+              <w:t>LOT 2 — Bâtiment accueil / sanitaires / vestiaires (clé en main)</w:t>
+            </w:r>
+          </w:p>
+        </w:tc>
+        <w:tc>
+          <w:tcPr>
+            <w:tcW w:type="dxa" w:w="113"/>
+          </w:tcPr>
+          <w:p>
+            <w:pPr>
+              <w:jc w:val="right"/>
+            </w:pPr>
+            <w:r/>
+            <w:r>
+              <w:rPr>
+                <w:b/>
+                <w:sz w:val="19"/>
+              </w:rPr>
+            </w:r>
+          </w:p>
+        </w:tc>
+        <w:tc>
+          <w:tcPr>
+            <w:tcW w:type="dxa" w:w="1247"/>
+          </w:tcPr>
+          <w:p>
+            <w:pPr>
+              <w:jc w:val="right"/>
+            </w:pPr>
+            <w:r/>
+            <w:r>
+              <w:rPr>
+                <w:b/>
+                <w:sz w:val="19"/>
+              </w:rPr>
+              <w:t>66 667</w:t>
+            </w:r>
+          </w:p>
+        </w:tc>
+        <w:tc>
+          <w:tcPr>
+            <w:tcW w:type="dxa" w:w="1361"/>
+          </w:tcPr>
+          <w:p>
+            <w:pPr>
+              <w:jc w:val="right"/>
+            </w:pPr>
+            <w:r/>
+            <w:r>
+              <w:rPr>
+                <w:b/>
+                <w:sz w:val="19"/>
+              </w:rPr>
+              <w:t>80 000</w:t>
+            </w:r>
+          </w:p>
+        </w:tc>
+      </w:tr>
+      <w:tr>
+        <w:tc>
+          <w:tcPr>
+            <w:tcW w:type="dxa" w:w="6236"/>
+          </w:tcPr>
+          <w:p>
+            <w:r/>
+            <w:r>
+              <w:rPr>
+                <w:sz w:val="19"/>
+              </w:rPr>
+              <w:t xml:space="preserve">  Fondations + dallage + maçonnerie / élévation</w:t>
+            </w:r>
+          </w:p>
+        </w:tc>
+        <w:tc>
+          <w:tcPr>
+            <w:tcW w:type="dxa" w:w="113"/>
+          </w:tcPr>
+          <w:p>
+            <w:pPr>
+              <w:jc w:val="right"/>
+            </w:pPr>
+            <w:r/>
+            <w:r>
+              <w:rPr>
+                <w:sz w:val="19"/>
+              </w:rPr>
+            </w:r>
+          </w:p>
+        </w:tc>
+        <w:tc>
+          <w:tcPr>
+            <w:tcW w:type="dxa" w:w="1247"/>
+          </w:tcPr>
+          <w:p>
+            <w:pPr>
+              <w:jc w:val="right"/>
+            </w:pPr>
+            <w:r/>
+            <w:r>
+              <w:rPr>
+                <w:sz w:val="19"/>
+              </w:rPr>
+            </w:r>
+          </w:p>
+        </w:tc>
+        <w:tc>
+          <w:tcPr>
+            <w:tcW w:type="dxa" w:w="1361"/>
+          </w:tcPr>
+          <w:p>
+            <w:pPr>
+              <w:jc w:val="right"/>
+            </w:pPr>
+            <w:r/>
+            <w:r>
+              <w:rPr>
+                <w:sz w:val="19"/>
+              </w:rPr>
+            </w:r>
+          </w:p>
+        </w:tc>
+      </w:tr>
+      <w:tr>
+        <w:tc>
+          <w:tcPr>
+            <w:tcW w:type="dxa" w:w="6236"/>
+          </w:tcPr>
+          <w:p>
+            <w:r/>
+            <w:r>
+              <w:rPr>
+                <w:sz w:val="19"/>
+              </w:rPr>
+              <w:t xml:space="preserve">  Sanitaires + vestiaires (plomberie, carrelage, faïence)</w:t>
+            </w:r>
+          </w:p>
+        </w:tc>
+        <w:tc>
+          <w:tcPr>
+            <w:tcW w:type="dxa" w:w="113"/>
+          </w:tcPr>
+          <w:p>
+            <w:pPr>
+              <w:jc w:val="right"/>
+            </w:pPr>
+            <w:r/>
+            <w:r>
+              <w:rPr>
+                <w:sz w:val="19"/>
+              </w:rPr>
+            </w:r>
+          </w:p>
+        </w:tc>
+        <w:tc>
+          <w:tcPr>
+            <w:tcW w:type="dxa" w:w="1247"/>
+          </w:tcPr>
+          <w:p>
+            <w:pPr>
+              <w:jc w:val="right"/>
+            </w:pPr>
+            <w:r/>
+            <w:r>
+              <w:rPr>
+                <w:sz w:val="19"/>
+              </w:rPr>
+            </w:r>
+          </w:p>
+        </w:tc>
+        <w:tc>
+          <w:tcPr>
+            <w:tcW w:type="dxa" w:w="1361"/>
+          </w:tcPr>
+          <w:p>
+            <w:pPr>
+              <w:jc w:val="right"/>
+            </w:pPr>
+            <w:r/>
+            <w:r>
+              <w:rPr>
+                <w:sz w:val="19"/>
+              </w:rPr>
+            </w:r>
+          </w:p>
+        </w:tc>
+      </w:tr>
+      <w:tr>
+        <w:tc>
+          <w:tcPr>
+            <w:tcW w:type="dxa" w:w="6236"/>
+          </w:tcPr>
+          <w:p>
+            <w:r/>
+            <w:r>
+              <w:rPr>
+                <w:sz w:val="19"/>
+              </w:rPr>
+              <w:t xml:space="preserve">  Toiture / étanchéité / menuiseries / peinture</w:t>
+            </w:r>
+          </w:p>
+        </w:tc>
+        <w:tc>
+          <w:tcPr>
+            <w:tcW w:type="dxa" w:w="113"/>
+          </w:tcPr>
+          <w:p>
+            <w:pPr>
+              <w:jc w:val="right"/>
+            </w:pPr>
+            <w:r/>
+            <w:r>
+              <w:rPr>
+                <w:sz w:val="19"/>
+              </w:rPr>
+            </w:r>
+          </w:p>
+        </w:tc>
+        <w:tc>
+          <w:tcPr>
+            <w:tcW w:type="dxa" w:w="1247"/>
+          </w:tcPr>
+          <w:p>
+            <w:pPr>
+              <w:jc w:val="right"/>
+            </w:pPr>
+            <w:r/>
+            <w:r>
+              <w:rPr>
+                <w:sz w:val="19"/>
+              </w:rPr>
+            </w:r>
+          </w:p>
+        </w:tc>
+        <w:tc>
+          <w:tcPr>
+            <w:tcW w:type="dxa" w:w="1361"/>
+          </w:tcPr>
+          <w:p>
+            <w:pPr>
+              <w:jc w:val="right"/>
+            </w:pPr>
+            <w:r/>
+            <w:r>
+              <w:rPr>
+                <w:sz w:val="19"/>
+              </w:rPr>
+            </w:r>
+          </w:p>
+        </w:tc>
+      </w:tr>
+      <w:tr>
+        <w:tc>
+          <w:tcPr>
+            <w:tcW w:type="dxa" w:w="6236"/>
+          </w:tcPr>
+          <w:p>
+            <w:r/>
+            <w:r>
+              <w:rPr>
+                <w:b/>
+                <w:sz w:val="19"/>
+              </w:rPr>
+              <w:t>LOT 3 — Forage puits + infrastructure hydraulique</w:t>
+            </w:r>
+          </w:p>
+        </w:tc>
+        <w:tc>
+          <w:tcPr>
+            <w:tcW w:type="dxa" w:w="113"/>
+          </w:tcPr>
+          <w:p>
+            <w:pPr>
+              <w:jc w:val="right"/>
+            </w:pPr>
+            <w:r/>
+            <w:r>
+              <w:rPr>
+                <w:b/>
+                <w:sz w:val="19"/>
+              </w:rPr>
+            </w:r>
+          </w:p>
+        </w:tc>
+        <w:tc>
+          <w:tcPr>
+            <w:tcW w:type="dxa" w:w="1247"/>
+          </w:tcPr>
+          <w:p>
+            <w:pPr>
+              <w:jc w:val="right"/>
+            </w:pPr>
+            <w:r/>
+            <w:r>
+              <w:rPr>
+                <w:b/>
+                <w:sz w:val="19"/>
+              </w:rPr>
+              <w:t>83 333</w:t>
+            </w:r>
+          </w:p>
+        </w:tc>
+        <w:tc>
+          <w:tcPr>
+            <w:tcW w:type="dxa" w:w="1361"/>
+          </w:tcPr>
+          <w:p>
+            <w:pPr>
+              <w:jc w:val="right"/>
+            </w:pPr>
+            <w:r/>
+            <w:r>
+              <w:rPr>
+                <w:b/>
+                <w:sz w:val="19"/>
+              </w:rPr>
+              <w:t>100 000</w:t>
+            </w:r>
+          </w:p>
+        </w:tc>
+      </w:tr>
+      <w:tr>
+        <w:tc>
+          <w:tcPr>
+            <w:tcW w:type="dxa" w:w="6236"/>
+          </w:tcPr>
+          <w:p>
+            <w:r/>
+            <w:r>
+              <w:rPr>
+                <w:sz w:val="19"/>
+              </w:rPr>
+              <w:t xml:space="preserve">  Forage / sondage / tubage</w:t>
+            </w:r>
+          </w:p>
+        </w:tc>
+        <w:tc>
+          <w:tcPr>
+            <w:tcW w:type="dxa" w:w="113"/>
+          </w:tcPr>
+          <w:p>
+            <w:pPr>
+              <w:jc w:val="right"/>
+            </w:pPr>
+            <w:r/>
+            <w:r>
+              <w:rPr>
+                <w:sz w:val="19"/>
+              </w:rPr>
+            </w:r>
+          </w:p>
+        </w:tc>
+        <w:tc>
+          <w:tcPr>
+            <w:tcW w:type="dxa" w:w="1247"/>
+          </w:tcPr>
+          <w:p>
+            <w:pPr>
+              <w:jc w:val="right"/>
+            </w:pPr>
+            <w:r/>
+            <w:r>
+              <w:rPr>
+                <w:sz w:val="19"/>
+              </w:rPr>
+            </w:r>
+          </w:p>
+        </w:tc>
+        <w:tc>
+          <w:tcPr>
+            <w:tcW w:type="dxa" w:w="1361"/>
+          </w:tcPr>
+          <w:p>
+            <w:pPr>
+              <w:jc w:val="right"/>
+            </w:pPr>
+            <w:r/>
+            <w:r>
+              <w:rPr>
+                <w:sz w:val="19"/>
+              </w:rPr>
+            </w:r>
+          </w:p>
+        </w:tc>
+      </w:tr>
+      <w:tr>
+        <w:tc>
+          <w:tcPr>
+            <w:tcW w:type="dxa" w:w="6236"/>
+          </w:tcPr>
+          <w:p>
+            <w:r/>
+            <w:r>
+              <w:rPr>
+                <w:sz w:val="19"/>
+              </w:rPr>
+              <w:t xml:space="preserve">  Réservoir / bâche à eau + raccordements</w:t>
+            </w:r>
+          </w:p>
+        </w:tc>
+        <w:tc>
+          <w:tcPr>
+            <w:tcW w:type="dxa" w:w="113"/>
+          </w:tcPr>
+          <w:p>
+            <w:pPr>
+              <w:jc w:val="right"/>
+            </w:pPr>
+            <w:r/>
+            <w:r>
+              <w:rPr>
+                <w:sz w:val="19"/>
+              </w:rPr>
+            </w:r>
+          </w:p>
+        </w:tc>
+        <w:tc>
+          <w:tcPr>
+            <w:tcW w:type="dxa" w:w="1247"/>
+          </w:tcPr>
+          <w:p>
+            <w:pPr>
+              <w:jc w:val="right"/>
+            </w:pPr>
+            <w:r/>
+            <w:r>
+              <w:rPr>
+                <w:sz w:val="19"/>
+              </w:rPr>
+            </w:r>
+          </w:p>
+        </w:tc>
+        <w:tc>
+          <w:tcPr>
+            <w:tcW w:type="dxa" w:w="1361"/>
+          </w:tcPr>
+          <w:p>
+            <w:pPr>
+              <w:jc w:val="right"/>
+            </w:pPr>
+            <w:r/>
+            <w:r>
+              <w:rPr>
+                <w:sz w:val="19"/>
+              </w:rPr>
+            </w:r>
+          </w:p>
+        </w:tc>
+      </w:tr>
+      <w:tr>
+        <w:tc>
+          <w:tcPr>
+            <w:tcW w:type="dxa" w:w="6236"/>
+          </w:tcPr>
+          <w:p>
+            <w:r/>
+            <w:r>
+              <w:rPr>
+                <w:sz w:val="19"/>
+              </w:rPr>
+              <w:t xml:space="preserve">  Réseau de distribution / irrigation</w:t>
+            </w:r>
+          </w:p>
+        </w:tc>
+        <w:tc>
+          <w:tcPr>
+            <w:tcW w:type="dxa" w:w="113"/>
+          </w:tcPr>
+          <w:p>
+            <w:pPr>
+              <w:jc w:val="right"/>
+            </w:pPr>
+            <w:r/>
+            <w:r>
+              <w:rPr>
+                <w:sz w:val="19"/>
+              </w:rPr>
+            </w:r>
+          </w:p>
+        </w:tc>
+        <w:tc>
+          <w:tcPr>
+            <w:tcW w:type="dxa" w:w="1247"/>
+          </w:tcPr>
+          <w:p>
+            <w:pPr>
+              <w:jc w:val="right"/>
+            </w:pPr>
+            <w:r/>
+            <w:r>
+              <w:rPr>
+                <w:sz w:val="19"/>
+              </w:rPr>
+            </w:r>
+          </w:p>
+        </w:tc>
+        <w:tc>
+          <w:tcPr>
+            <w:tcW w:type="dxa" w:w="1361"/>
+          </w:tcPr>
+          <w:p>
+            <w:pPr>
+              <w:jc w:val="right"/>
+            </w:pPr>
+            <w:r/>
+            <w:r>
+              <w:rPr>
+                <w:sz w:val="19"/>
+              </w:rPr>
+            </w:r>
+          </w:p>
+        </w:tc>
+      </w:tr>
+      <w:tr>
+        <w:tc>
+          <w:tcPr>
+            <w:tcW w:type="dxa" w:w="6236"/>
+          </w:tcPr>
+          <w:p>
+            <w:r/>
+            <w:r>
+              <w:rPr>
+                <w:b/>
+                <w:sz w:val="19"/>
+              </w:rPr>
+              <w:t>LOT 4 — Réseaux, électricité extérieure &amp; paysager (communs)</w:t>
+            </w:r>
+          </w:p>
+        </w:tc>
+        <w:tc>
+          <w:tcPr>
+            <w:tcW w:type="dxa" w:w="113"/>
+          </w:tcPr>
+          <w:p>
+            <w:pPr>
+              <w:jc w:val="right"/>
+            </w:pPr>
+            <w:r/>
+            <w:r>
+              <w:rPr>
+                <w:b/>
+                <w:sz w:val="19"/>
+              </w:rPr>
+            </w:r>
+          </w:p>
+        </w:tc>
+        <w:tc>
+          <w:tcPr>
+            <w:tcW w:type="dxa" w:w="1247"/>
+          </w:tcPr>
+          <w:p>
+            <w:pPr>
+              <w:jc w:val="right"/>
+            </w:pPr>
+            <w:r/>
+            <w:r>
+              <w:rPr>
+                <w:b/>
+                <w:sz w:val="19"/>
+              </w:rPr>
+              <w:t>41 667</w:t>
+            </w:r>
+          </w:p>
+        </w:tc>
+        <w:tc>
+          <w:tcPr>
+            <w:tcW w:type="dxa" w:w="1361"/>
+          </w:tcPr>
+          <w:p>
+            <w:pPr>
+              <w:jc w:val="right"/>
+            </w:pPr>
+            <w:r/>
+            <w:r>
+              <w:rPr>
+                <w:b/>
+                <w:sz w:val="19"/>
+              </w:rPr>
+              <w:t>50 000</w:t>
+            </w:r>
+          </w:p>
+        </w:tc>
+      </w:tr>
+      <w:tr>
+        <w:tc>
+          <w:tcPr>
+            <w:tcW w:type="dxa" w:w="6236"/>
+          </w:tcPr>
+          <w:p>
+            <w:r/>
+            <w:r>
+              <w:rPr>
+                <w:sz w:val="19"/>
+              </w:rPr>
+              <w:t xml:space="preserve">  Réseau électrique enterré + tableau + éclairage extérieur</w:t>
+            </w:r>
+          </w:p>
+        </w:tc>
+        <w:tc>
+          <w:tcPr>
+            <w:tcW w:type="dxa" w:w="113"/>
+          </w:tcPr>
+          <w:p>
+            <w:pPr>
+              <w:jc w:val="right"/>
+            </w:pPr>
+            <w:r/>
+            <w:r>
+              <w:rPr>
+                <w:sz w:val="19"/>
+              </w:rPr>
+            </w:r>
+          </w:p>
+        </w:tc>
+        <w:tc>
+          <w:tcPr>
+            <w:tcW w:type="dxa" w:w="1247"/>
+          </w:tcPr>
+          <w:p>
+            <w:pPr>
+              <w:jc w:val="right"/>
+            </w:pPr>
+            <w:r/>
+            <w:r>
+              <w:rPr>
+                <w:sz w:val="19"/>
+              </w:rPr>
+            </w:r>
+          </w:p>
+        </w:tc>
+        <w:tc>
+          <w:tcPr>
+            <w:tcW w:type="dxa" w:w="1361"/>
+          </w:tcPr>
+          <w:p>
+            <w:pPr>
+              <w:jc w:val="right"/>
+            </w:pPr>
+            <w:r/>
+            <w:r>
+              <w:rPr>
+                <w:sz w:val="19"/>
+              </w:rPr>
+            </w:r>
+          </w:p>
+        </w:tc>
+      </w:tr>
+      <w:tr>
+        <w:tc>
+          <w:tcPr>
+            <w:tcW w:type="dxa" w:w="6236"/>
+          </w:tcPr>
+          <w:p>
+            <w:r/>
+            <w:r>
+              <w:rPr>
+                <w:sz w:val="19"/>
+              </w:rPr>
+              <w:t xml:space="preserve">  Réseau d'eau / assainissement, plantations &amp; zones ombragées</w:t>
+            </w:r>
+          </w:p>
+        </w:tc>
+        <w:tc>
+          <w:tcPr>
+            <w:tcW w:type="dxa" w:w="113"/>
+          </w:tcPr>
+          <w:p>
+            <w:pPr>
+              <w:jc w:val="right"/>
+            </w:pPr>
+            <w:r/>
+            <w:r>
+              <w:rPr>
+                <w:sz w:val="19"/>
+              </w:rPr>
+            </w:r>
+          </w:p>
+        </w:tc>
+        <w:tc>
+          <w:tcPr>
+            <w:tcW w:type="dxa" w:w="1247"/>
+          </w:tcPr>
+          <w:p>
+            <w:pPr>
+              <w:jc w:val="right"/>
+            </w:pPr>
+            <w:r/>
+            <w:r>
+              <w:rPr>
+                <w:sz w:val="19"/>
+              </w:rPr>
+            </w:r>
+          </w:p>
+        </w:tc>
+        <w:tc>
+          <w:tcPr>
+            <w:tcW w:type="dxa" w:w="1361"/>
+          </w:tcPr>
+          <w:p>
+            <w:pPr>
+              <w:jc w:val="right"/>
+            </w:pPr>
+            <w:r/>
+            <w:r>
+              <w:rPr>
+                <w:sz w:val="19"/>
+              </w:rPr>
+            </w:r>
+          </w:p>
+        </w:tc>
+      </w:tr>
+      <w:tr>
+        <w:tc>
+          <w:tcPr>
+            <w:tcW w:type="dxa" w:w="6236"/>
+          </w:tcPr>
+          <w:p>
+            <w:r/>
+            <w:r>
+              <w:rPr>
+                <w:b/>
+                <w:sz w:val="19"/>
+              </w:rPr>
+              <w:t>LOT 5 — Voirie, allées, parking, clôtures, signalétique</w:t>
+            </w:r>
+          </w:p>
+        </w:tc>
+        <w:tc>
+          <w:tcPr>
+            <w:tcW w:type="dxa" w:w="113"/>
+          </w:tcPr>
+          <w:p>
+            <w:pPr>
+              <w:jc w:val="right"/>
+            </w:pPr>
+            <w:r/>
+            <w:r>
+              <w:rPr>
+                <w:b/>
+                <w:sz w:val="19"/>
+              </w:rPr>
+            </w:r>
+          </w:p>
+        </w:tc>
+        <w:tc>
+          <w:tcPr>
+            <w:tcW w:type="dxa" w:w="1247"/>
+          </w:tcPr>
+          <w:p>
+            <w:pPr>
+              <w:jc w:val="right"/>
+            </w:pPr>
+            <w:r/>
+            <w:r>
+              <w:rPr>
+                <w:b/>
+                <w:sz w:val="19"/>
+              </w:rPr>
+              <w:t>50 000</w:t>
+            </w:r>
+          </w:p>
+        </w:tc>
+        <w:tc>
+          <w:tcPr>
+            <w:tcW w:type="dxa" w:w="1361"/>
+          </w:tcPr>
+          <w:p>
+            <w:pPr>
+              <w:jc w:val="right"/>
+            </w:pPr>
+            <w:r/>
+            <w:r>
+              <w:rPr>
+                <w:b/>
+                <w:sz w:val="19"/>
+              </w:rPr>
+              <w:t>60 000</w:t>
+            </w:r>
+          </w:p>
+        </w:tc>
+      </w:tr>
+      <w:tr>
+        <w:tc>
+          <w:tcPr>
+            <w:tcW w:type="dxa" w:w="6236"/>
+          </w:tcPr>
+          <w:p>
+            <w:r/>
+            <w:r>
+              <w:rPr>
+                <w:sz w:val="19"/>
+              </w:rPr>
+              <w:t xml:space="preserve">  Allées piétonnes, parking stabilisé</w:t>
+            </w:r>
+          </w:p>
+        </w:tc>
+        <w:tc>
+          <w:tcPr>
+            <w:tcW w:type="dxa" w:w="113"/>
+          </w:tcPr>
+          <w:p>
+            <w:pPr>
+              <w:jc w:val="right"/>
+            </w:pPr>
+            <w:r/>
+            <w:r>
+              <w:rPr>
+                <w:sz w:val="19"/>
+              </w:rPr>
+            </w:r>
+          </w:p>
+        </w:tc>
+        <w:tc>
+          <w:tcPr>
+            <w:tcW w:type="dxa" w:w="1247"/>
+          </w:tcPr>
+          <w:p>
+            <w:pPr>
+              <w:jc w:val="right"/>
+            </w:pPr>
+            <w:r/>
+            <w:r>
+              <w:rPr>
+                <w:sz w:val="19"/>
+              </w:rPr>
+            </w:r>
+          </w:p>
+        </w:tc>
+        <w:tc>
+          <w:tcPr>
+            <w:tcW w:type="dxa" w:w="1361"/>
+          </w:tcPr>
+          <w:p>
+            <w:pPr>
+              <w:jc w:val="right"/>
+            </w:pPr>
+            <w:r/>
+            <w:r>
+              <w:rPr>
+                <w:sz w:val="19"/>
+              </w:rPr>
+            </w:r>
+          </w:p>
+        </w:tc>
+      </w:tr>
+      <w:tr>
+        <w:tc>
+          <w:tcPr>
+            <w:tcW w:type="dxa" w:w="6236"/>
+          </w:tcPr>
+          <w:p>
+            <w:r/>
+            <w:r>
+              <w:rPr>
+                <w:sz w:val="19"/>
+              </w:rPr>
+              <w:t xml:space="preserve">  Clôture périmétrique + portail + signalétique</w:t>
+            </w:r>
+          </w:p>
+        </w:tc>
+        <w:tc>
+          <w:tcPr>
+            <w:tcW w:type="dxa" w:w="113"/>
+          </w:tcPr>
+          <w:p>
+            <w:pPr>
+              <w:jc w:val="right"/>
+            </w:pPr>
+            <w:r/>
+            <w:r>
+              <w:rPr>
+                <w:sz w:val="19"/>
+              </w:rPr>
+            </w:r>
+          </w:p>
+        </w:tc>
+        <w:tc>
+          <w:tcPr>
+            <w:tcW w:type="dxa" w:w="1247"/>
+          </w:tcPr>
+          <w:p>
+            <w:pPr>
+              <w:jc w:val="right"/>
+            </w:pPr>
+            <w:r/>
+            <w:r>
+              <w:rPr>
+                <w:sz w:val="19"/>
+              </w:rPr>
+            </w:r>
+          </w:p>
+        </w:tc>
+        <w:tc>
+          <w:tcPr>
+            <w:tcW w:type="dxa" w:w="1361"/>
+          </w:tcPr>
+          <w:p>
+            <w:pPr>
+              <w:jc w:val="right"/>
+            </w:pPr>
+            <w:r/>
+            <w:r>
+              <w:rPr>
+                <w:sz w:val="19"/>
+              </w:rPr>
+            </w:r>
+          </w:p>
+        </w:tc>
+      </w:tr>
+      <w:tr>
+        <w:tc>
+          <w:tcPr>
+            <w:tcW w:type="dxa" w:w="6236"/>
+          </w:tcPr>
+          <w:p>
+            <w:r/>
+            <w:r>
+              <w:rPr>
+                <w:b/>
+                <w:sz w:val="19"/>
+              </w:rPr>
+              <w:t>LOT 6 — Espace « du jardin à l'assiette »</w:t>
+            </w:r>
+          </w:p>
+        </w:tc>
+        <w:tc>
+          <w:tcPr>
+            <w:tcW w:type="dxa" w:w="113"/>
+          </w:tcPr>
+          <w:p>
+            <w:pPr>
+              <w:jc w:val="right"/>
+            </w:pPr>
+            <w:r/>
+            <w:r>
+              <w:rPr>
+                <w:b/>
+                <w:sz w:val="19"/>
+              </w:rPr>
+            </w:r>
+          </w:p>
+        </w:tc>
+        <w:tc>
+          <w:tcPr>
+            <w:tcW w:type="dxa" w:w="1247"/>
+          </w:tcPr>
+          <w:p>
+            <w:pPr>
+              <w:jc w:val="right"/>
+            </w:pPr>
+            <w:r/>
+            <w:r>
+              <w:rPr>
+                <w:b/>
+                <w:sz w:val="19"/>
+              </w:rPr>
+              <w:t>25 000</w:t>
+            </w:r>
+          </w:p>
+        </w:tc>
+        <w:tc>
+          <w:tcPr>
+            <w:tcW w:type="dxa" w:w="1361"/>
+          </w:tcPr>
+          <w:p>
+            <w:pPr>
+              <w:jc w:val="right"/>
+            </w:pPr>
+            <w:r/>
+            <w:r>
+              <w:rPr>
+                <w:b/>
+                <w:sz w:val="19"/>
+              </w:rPr>
+              <w:t>30 000</w:t>
+            </w:r>
+          </w:p>
+        </w:tc>
+      </w:tr>
+      <w:tr>
+        <w:tc>
+          <w:tcPr>
+            <w:tcW w:type="dxa" w:w="6236"/>
+          </w:tcPr>
+          <w:p>
+            <w:r/>
+            <w:r>
+              <w:rPr>
+                <w:sz w:val="19"/>
+              </w:rPr>
+              <w:t xml:space="preserve">  Bacs potagers, irrigation, pergola / zone atelier extérieure</w:t>
+            </w:r>
+          </w:p>
+        </w:tc>
+        <w:tc>
+          <w:tcPr>
+            <w:tcW w:type="dxa" w:w="113"/>
+          </w:tcPr>
+          <w:p>
+            <w:pPr>
+              <w:jc w:val="right"/>
+            </w:pPr>
+            <w:r/>
+            <w:r>
+              <w:rPr>
+                <w:sz w:val="19"/>
+              </w:rPr>
+            </w:r>
+          </w:p>
+        </w:tc>
+        <w:tc>
+          <w:tcPr>
+            <w:tcW w:type="dxa" w:w="1247"/>
+          </w:tcPr>
+          <w:p>
+            <w:pPr>
+              <w:jc w:val="right"/>
+            </w:pPr>
+            <w:r/>
+            <w:r>
+              <w:rPr>
+                <w:sz w:val="19"/>
+              </w:rPr>
+            </w:r>
+          </w:p>
+        </w:tc>
+        <w:tc>
+          <w:tcPr>
+            <w:tcW w:type="dxa" w:w="1361"/>
+          </w:tcPr>
+          <w:p>
+            <w:pPr>
+              <w:jc w:val="right"/>
+            </w:pPr>
+            <w:r/>
+            <w:r>
+              <w:rPr>
+                <w:sz w:val="19"/>
+              </w:rPr>
+            </w:r>
+          </w:p>
+        </w:tc>
+      </w:tr>
+      <w:tr>
+        <w:tc>
+          <w:tcPr>
+            <w:tcW w:type="dxa" w:w="6236"/>
+          </w:tcPr>
+          <w:p>
+            <w:r/>
+            <w:r>
+              <w:rPr>
+                <w:b/>
+                <w:sz w:val="19"/>
+              </w:rPr>
+              <w:t>TOTAL TRAVAUX CONSTRUCTION &amp; AMÉNAGEMENT</w:t>
+            </w:r>
+          </w:p>
+        </w:tc>
+        <w:tc>
+          <w:tcPr>
+            <w:tcW w:type="dxa" w:w="113"/>
+          </w:tcPr>
+          <w:p>
+            <w:pPr>
+              <w:jc w:val="right"/>
+            </w:pPr>
+            <w:r/>
+            <w:r>
+              <w:rPr>
+                <w:b/>
+                <w:sz w:val="19"/>
+              </w:rPr>
+            </w:r>
+          </w:p>
+        </w:tc>
+        <w:tc>
+          <w:tcPr>
+            <w:tcW w:type="dxa" w:w="1247"/>
+          </w:tcPr>
+          <w:p>
+            <w:pPr>
+              <w:jc w:val="right"/>
+            </w:pPr>
+            <w:r/>
+            <w:r>
+              <w:rPr>
+                <w:b/>
+                <w:sz w:val="19"/>
+              </w:rPr>
+              <w:t>291 667</w:t>
+            </w:r>
+          </w:p>
+        </w:tc>
+        <w:tc>
+          <w:tcPr>
+            <w:tcW w:type="dxa" w:w="1361"/>
+          </w:tcPr>
+          <w:p>
+            <w:pPr>
+              <w:jc w:val="right"/>
+            </w:pPr>
+            <w:r/>
+            <w:r>
+              <w:rPr>
+                <w:b/>
+                <w:sz w:val="19"/>
+              </w:rPr>
+              <w:t>350 000</w:t>
             </w:r>
           </w:p>
         </w:tc>
@@ -2928,472 +4002,7 @@
           <w:color w:val="555555"/>
           <w:sz w:val="19"/>
         </w:rPr>
-        <w:t>Aucun recours au leasing ni au crédit fournisseur. La prime est intégrée au montage financier conformément au règlement. La partie hors primable (piscine + BFR = 120 000) est portée par les fonds propres.</w:t>
-      </w:r>
-    </w:p>
-    <w:p>
-      <w:pPr>
-        <w:spacing w:after="120" w:before="200"/>
-      </w:pPr>
-      <w:r>
-        <w:rPr>
-          <w:b/>
-          <w:color w:val="1B3A28"/>
-          <w:sz w:val="30"/>
-        </w:rPr>
-        <w:t>6. Synthèse de conformité</w:t>
-      </w:r>
-    </w:p>
-    <w:tbl>
-      <w:tblPr>
-        <w:tblStyle w:val="LightGrid-Accent1"/>
-        <w:tblW w:type="auto" w:w="0"/>
-        <w:jc w:val="center"/>
-        <w:tblLook w:firstColumn="1" w:firstRow="1" w:lastColumn="0" w:lastRow="0" w:noHBand="0" w:noVBand="1" w:val="04A0"/>
-      </w:tblPr>
-      <w:tblGrid>
-        <w:gridCol w:w="2880"/>
-        <w:gridCol w:w="2880"/>
-        <w:gridCol w:w="2880"/>
-      </w:tblGrid>
-      <w:tr>
-        <w:tc>
-          <w:tcPr>
-            <w:tcW w:type="dxa" w:w="3118"/>
-            <w:shd w:fill="1B3A28"/>
-          </w:tcPr>
-          <w:p>
-            <w:r/>
-            <w:r>
-              <w:rPr>
-                <w:b/>
-                <w:color w:val="FFFFFF"/>
-                <w:sz w:val="19"/>
-              </w:rPr>
-              <w:t>Indicateur</w:t>
-            </w:r>
-          </w:p>
-        </w:tc>
-        <w:tc>
-          <w:tcPr>
-            <w:tcW w:type="dxa" w:w="1701"/>
-            <w:shd w:fill="1B3A28"/>
-          </w:tcPr>
-          <w:p>
-            <w:r/>
-            <w:r>
-              <w:rPr>
-                <w:b/>
-                <w:color w:val="FFFFFF"/>
-                <w:sz w:val="19"/>
-              </w:rPr>
-              <w:t>Valeur</w:t>
-            </w:r>
-          </w:p>
-        </w:tc>
-        <w:tc>
-          <w:tcPr>
-            <w:tcW w:type="dxa" w:w="3969"/>
-            <w:shd w:fill="1B3A28"/>
-          </w:tcPr>
-          <w:p>
-            <w:r/>
-            <w:r>
-              <w:rPr>
-                <w:b/>
-                <w:color w:val="FFFFFF"/>
-                <w:sz w:val="19"/>
-              </w:rPr>
-              <w:t>Conformité règlement</w:t>
-            </w:r>
-          </w:p>
-        </w:tc>
-      </w:tr>
-      <w:tr>
-        <w:tc>
-          <w:tcPr>
-            <w:tcW w:type="dxa" w:w="3118"/>
-          </w:tcPr>
-          <w:p>
-            <w:r/>
-            <w:r>
-              <w:rPr>
-                <w:sz w:val="19"/>
-              </w:rPr>
-              <w:t>Coût total du projet (TTC)</w:t>
-            </w:r>
-          </w:p>
-        </w:tc>
-        <w:tc>
-          <w:tcPr>
-            <w:tcW w:type="dxa" w:w="1701"/>
-          </w:tcPr>
-          <w:p>
-            <w:pPr>
-              <w:jc w:val="right"/>
-            </w:pPr>
-            <w:r/>
-            <w:r>
-              <w:rPr>
-                <w:sz w:val="19"/>
-              </w:rPr>
-              <w:t>1 091 000 DH</w:t>
-            </w:r>
-          </w:p>
-        </w:tc>
-        <w:tc>
-          <w:tcPr>
-            <w:tcW w:type="dxa" w:w="3969"/>
-          </w:tcPr>
-          <w:p>
-            <w:pPr>
-              <w:jc w:val="right"/>
-            </w:pPr>
-            <w:r/>
-            <w:r>
-              <w:rPr>
-                <w:sz w:val="19"/>
-              </w:rPr>
-              <w:t>Inférieur à 10 MDH → taux de prime 35 %</w:t>
-            </w:r>
-          </w:p>
-        </w:tc>
-      </w:tr>
-      <w:tr>
-        <w:tc>
-          <w:tcPr>
-            <w:tcW w:type="dxa" w:w="3118"/>
-          </w:tcPr>
-          <w:p>
-            <w:r/>
-            <w:r>
-              <w:rPr>
-                <w:sz w:val="19"/>
-              </w:rPr>
-              <w:t>Constructions / projet</w:t>
-            </w:r>
-          </w:p>
-        </w:tc>
-        <w:tc>
-          <w:tcPr>
-            <w:tcW w:type="dxa" w:w="1701"/>
-          </w:tcPr>
-          <w:p>
-            <w:pPr>
-              <w:jc w:val="right"/>
-            </w:pPr>
-            <w:r/>
-            <w:r>
-              <w:rPr>
-                <w:sz w:val="19"/>
-              </w:rPr>
-              <w:t>16,0 %</w:t>
-            </w:r>
-          </w:p>
-        </w:tc>
-        <w:tc>
-          <w:tcPr>
-            <w:tcW w:type="dxa" w:w="3969"/>
-          </w:tcPr>
-          <w:p>
-            <w:pPr>
-              <w:jc w:val="right"/>
-            </w:pPr>
-            <w:r/>
-            <w:r>
-              <w:rPr>
-                <w:sz w:val="19"/>
-              </w:rPr>
-              <w:t>≤ 20 % — Conforme</w:t>
-            </w:r>
-          </w:p>
-        </w:tc>
-      </w:tr>
-      <w:tr>
-        <w:tc>
-          <w:tcPr>
-            <w:tcW w:type="dxa" w:w="3118"/>
-          </w:tcPr>
-          <w:p>
-            <w:r/>
-            <w:r>
-              <w:rPr>
-                <w:sz w:val="19"/>
-              </w:rPr>
-              <w:t>Frais préliminaires + divers / projet</w:t>
-            </w:r>
-          </w:p>
-        </w:tc>
-        <w:tc>
-          <w:tcPr>
-            <w:tcW w:type="dxa" w:w="1701"/>
-          </w:tcPr>
-          <w:p>
-            <w:pPr>
-              <w:jc w:val="right"/>
-            </w:pPr>
-            <w:r/>
-            <w:r>
-              <w:rPr>
-                <w:sz w:val="19"/>
-              </w:rPr>
-              <w:t>4,4 %</w:t>
-            </w:r>
-          </w:p>
-        </w:tc>
-        <w:tc>
-          <w:tcPr>
-            <w:tcW w:type="dxa" w:w="3969"/>
-          </w:tcPr>
-          <w:p>
-            <w:pPr>
-              <w:jc w:val="right"/>
-            </w:pPr>
-            <w:r/>
-            <w:r>
-              <w:rPr>
-                <w:sz w:val="19"/>
-              </w:rPr>
-              <w:t>≤ 5 % — Conforme</w:t>
-            </w:r>
-          </w:p>
-        </w:tc>
-      </w:tr>
-      <w:tr>
-        <w:tc>
-          <w:tcPr>
-            <w:tcW w:type="dxa" w:w="3118"/>
-          </w:tcPr>
-          <w:p>
-            <w:r/>
-            <w:r>
-              <w:rPr>
-                <w:sz w:val="19"/>
-              </w:rPr>
-              <w:t>CMT / programme primable</w:t>
-            </w:r>
-          </w:p>
-        </w:tc>
-        <w:tc>
-          <w:tcPr>
-            <w:tcW w:type="dxa" w:w="1701"/>
-          </w:tcPr>
-          <w:p>
-            <w:pPr>
-              <w:jc w:val="right"/>
-            </w:pPr>
-            <w:r/>
-            <w:r>
-              <w:rPr>
-                <w:sz w:val="19"/>
-              </w:rPr>
-              <w:t>50,0 %</w:t>
-            </w:r>
-          </w:p>
-        </w:tc>
-        <w:tc>
-          <w:tcPr>
-            <w:tcW w:type="dxa" w:w="3969"/>
-          </w:tcPr>
-          <w:p>
-            <w:pPr>
-              <w:jc w:val="right"/>
-            </w:pPr>
-            <w:r/>
-            <w:r>
-              <w:rPr>
-                <w:sz w:val="19"/>
-              </w:rPr>
-              <w:t>≤ 50 % — Conforme</w:t>
-            </w:r>
-          </w:p>
-        </w:tc>
-      </w:tr>
-      <w:tr>
-        <w:tc>
-          <w:tcPr>
-            <w:tcW w:type="dxa" w:w="3118"/>
-          </w:tcPr>
-          <w:p>
-            <w:r/>
-            <w:r>
-              <w:rPr>
-                <w:sz w:val="19"/>
-              </w:rPr>
-              <w:t>Apport fonds propres / programme primable</w:t>
-            </w:r>
-          </w:p>
-        </w:tc>
-        <w:tc>
-          <w:tcPr>
-            <w:tcW w:type="dxa" w:w="1701"/>
-          </w:tcPr>
-          <w:p>
-            <w:pPr>
-              <w:jc w:val="right"/>
-            </w:pPr>
-            <w:r/>
-            <w:r>
-              <w:rPr>
-                <w:sz w:val="19"/>
-              </w:rPr>
-              <w:t>≥ 15 %</w:t>
-            </w:r>
-          </w:p>
-        </w:tc>
-        <w:tc>
-          <w:tcPr>
-            <w:tcW w:type="dxa" w:w="3969"/>
-          </w:tcPr>
-          <w:p>
-            <w:pPr>
-              <w:jc w:val="right"/>
-            </w:pPr>
-            <w:r/>
-            <w:r>
-              <w:rPr>
-                <w:sz w:val="19"/>
-              </w:rPr>
-              <w:t>Conforme</w:t>
-            </w:r>
-          </w:p>
-        </w:tc>
-      </w:tr>
-      <w:tr>
-        <w:tc>
-          <w:tcPr>
-            <w:tcW w:type="dxa" w:w="3118"/>
-          </w:tcPr>
-          <w:p>
-            <w:r/>
-            <w:r>
-              <w:rPr>
-                <w:sz w:val="19"/>
-              </w:rPr>
-              <w:t>Matériel : état des biens</w:t>
-            </w:r>
-          </w:p>
-        </w:tc>
-        <w:tc>
-          <w:tcPr>
-            <w:tcW w:type="dxa" w:w="1701"/>
-          </w:tcPr>
-          <w:p>
-            <w:pPr>
-              <w:jc w:val="right"/>
-            </w:pPr>
-            <w:r/>
-            <w:r>
-              <w:rPr>
-                <w:sz w:val="19"/>
-              </w:rPr>
-              <w:t>Neuf</w:t>
-            </w:r>
-          </w:p>
-        </w:tc>
-        <w:tc>
-          <w:tcPr>
-            <w:tcW w:type="dxa" w:w="3969"/>
-          </w:tcPr>
-          <w:p>
-            <w:pPr>
-              <w:jc w:val="right"/>
-            </w:pPr>
-            <w:r/>
-            <w:r>
-              <w:rPr>
-                <w:sz w:val="19"/>
-              </w:rPr>
-              <w:t>Attestation de neuf au déblocage</w:t>
-            </w:r>
-          </w:p>
-        </w:tc>
-      </w:tr>
-    </w:tbl>
-    <w:p>
-      <w:pPr>
-        <w:spacing w:after="120" w:before="200"/>
-      </w:pPr>
-      <w:r>
-        <w:rPr>
-          <w:b/>
-          <w:color w:val="1B3A28"/>
-          <w:sz w:val="30"/>
-        </w:rPr>
-        <w:t>7. Changements par rapport à la version précédente du dossier</w:t>
-      </w:r>
-    </w:p>
-    <w:p>
-      <w:pPr>
-        <w:spacing w:after="80"/>
-      </w:pPr>
-      <w:r>
-        <w:rPr>
-          <w:b w:val="0"/>
-          <w:sz w:val="21"/>
-        </w:rPr>
-        <w:t>La seule modification de structure par rapport au modèle Excel initial est la suivante :</w:t>
-      </w:r>
-    </w:p>
-    <w:p>
-      <w:pPr>
-        <w:spacing w:after="60"/>
-      </w:pPr>
-      <w:r>
-        <w:rPr>
-          <w:b w:val="0"/>
-          <w:sz w:val="20"/>
-        </w:rPr>
-        <w:t>• Le poste « Puits + équipement hydraulique (clé en main) » de 100 000 DH TTC est scindé en deux : « Puits — forage + génie civil » (65 000 DH TTC, en Constructions) et « Pompe + équipement hydraulique » (35 000 DH TTC, basculé en Matériel d'équipement).</w:t>
-      </w:r>
-    </w:p>
-    <w:p>
-      <w:pPr>
-        <w:spacing w:after="60"/>
-      </w:pPr>
-      <w:r>
-        <w:rPr>
-          <w:b w:val="0"/>
-          <w:sz w:val="20"/>
-        </w:rPr>
-        <w:t>• Effet : la rubrique Constructions passe de 210 000 DH (19,2 % du projet) à 175 000 DH (16,0 %), et le Matériel passe de 403 000 DH à 438 000 DH.</w:t>
-      </w:r>
-    </w:p>
-    <w:p>
-      <w:pPr>
-        <w:spacing w:after="60"/>
-      </w:pPr>
-      <w:r>
-        <w:rPr>
-          <w:b w:val="0"/>
-          <w:sz w:val="20"/>
-        </w:rPr>
-        <w:t>• Le total du programme primable (971 000 DH), le montant de la prime (339 850 DH) et le plan de financement restent strictement inchangés.</w:t>
-      </w:r>
-    </w:p>
-    <w:p>
-      <w:pPr>
-        <w:spacing w:after="60"/>
-      </w:pPr>
-      <w:r>
-        <w:rPr>
-          <w:b w:val="0"/>
-          <w:sz w:val="20"/>
-        </w:rPr>
-        <w:t>• Objectif : éloigner la rubrique Constructions du plafond de 20 % afin de sécuriser la prime en cas de dépassement de coût au moment des devis/factures définitifs.</w:t>
-      </w:r>
-    </w:p>
-    <w:p>
-      <w:pPr>
-        <w:spacing w:after="80"/>
-      </w:pPr>
-      <w:r>
-        <w:rPr>
-          <w:b w:val="0"/>
-          <w:color w:val="555555"/>
-          <w:sz w:val="19"/>
-        </w:rPr>
-        <w:t>Aucun autre changement : nature des activités, montants par activité (paintball 140 000, e-bike 130 000 + accessoires 18 000, cuisine 45 000, solaire 70 000), aménagements et frais préliminaires demeurent identiques au business plan.</w:t>
+        <w:t>Tous les travaux : état NEUF, facture au nom de DA21 SARL AU, règlement par le compte bancaire de la société. Devis détaillé par lot demandé, daté/signé/cacheté.</w:t>
       </w:r>
     </w:p>
     <w:sectPr>

</xml_diff>